<commit_message>
add Overall Implementation Design docs
</commit_message>
<xml_diff>
--- a/docs/cn/design/05_基本设计书_权利文书.docx
+++ b/docs/cn/design/05_基本设计书_权利文书.docx
@@ -282,7 +282,7 @@
         <w:rPr>
           <w:rFonts w:ascii="Microsoft YaHei" w:eastAsia="Microsoft YaHei" w:hAnsi="Microsoft YaHei"/>
         </w:rPr>
-        <w:t xml:space="preserve">承接的决定如下表（设计计划书第2版的决定、待调查、未决，以及项目划分中发现的遗漏）。</w:t>
+        <w:t xml:space="preserve">承接的决定如下表（设计计划书第2版的决定、待调查、未决，以及项目划分中发现的遗漏）。设计计划书的决定、待调查、未决的文字依第13章 1.2“从设计计划书的决定到概要设计书、基本设计的对应”与概要设计书的去向表（本章不转载，只载编号与项目划分中发现的遗漏）。</w:t>
       </w:r>
     </w:p>
     <w:tbl>
@@ -298,9 +298,9 @@
         </w:tblBorders>
       </w:tblPr>
       <w:tblGrid>
-        <w:gridCol w:w="891"/>
-        <w:gridCol w:w="4207"/>
-        <w:gridCol w:w="4540"/>
+        <w:gridCol w:w="908"/>
+        <w:gridCol w:w="2686"/>
+        <w:gridCol w:w="6044"/>
       </w:tblGrid>
       <w:tr>
         <w:trPr>
@@ -309,7 +309,7 @@
         </w:trPr>
         <w:tc>
           <w:tcPr>
-            <w:tcW w:type="dxa" w:w="891"/>
+            <w:tcW w:type="dxa" w:w="908"/>
             <w:tcBorders>
               <w:top w:val="single" w:color="A6B8D0" w:sz="4"/>
               <w:left w:val="single" w:color="A6B8D0" w:sz="4"/>
@@ -344,7 +344,7 @@
         </w:tc>
         <w:tc>
           <w:tcPr>
-            <w:tcW w:type="dxa" w:w="4207"/>
+            <w:tcW w:type="dxa" w:w="2686"/>
             <w:tcBorders>
               <w:top w:val="single" w:color="A6B8D0" w:sz="4"/>
               <w:left w:val="single" w:color="A6B8D0" w:sz="4"/>
@@ -379,7 +379,7 @@
         </w:tc>
         <w:tc>
           <w:tcPr>
-            <w:tcW w:type="dxa" w:w="4540"/>
+            <w:tcW w:type="dxa" w:w="6044"/>
             <w:tcBorders>
               <w:top w:val="single" w:color="A6B8D0" w:sz="4"/>
               <w:left w:val="single" w:color="A6B8D0" w:sz="4"/>
@@ -420,103 +420,103 @@
         </w:trPr>
         <w:tc>
           <w:tcPr>
-            <w:tcW w:type="dxa" w:w="891"/>
-            <w:tcBorders>
-              <w:top w:val="single" w:color="A6B8D0" w:sz="4"/>
-              <w:left w:val="single" w:color="A6B8D0" w:sz="4"/>
-              <w:bottom w:val="single" w:color="A6B8D0" w:sz="4"/>
-              <w:right w:val="single" w:color="A6B8D0" w:sz="4"/>
-            </w:tcBorders>
-            <w:tcMar>
-              <w:top w:type="dxa" w:w="50"/>
-              <w:left w:type="dxa" w:w="90"/>
-              <w:bottom w:type="dxa" w:w="50"/>
-              <w:right w:type="dxa" w:w="90"/>
-            </w:tcMar>
-          </w:tcPr>
-          <w:p>
-            <w:pPr>
-              <w:keepNext/>
-              <w:keepLines/>
-              <w:spacing w:after="0" w:before="0" w:line="280"/>
-            </w:pPr>
-            <w:r>
-              <w:rPr>
-                <w:rFonts w:ascii="Microsoft YaHei" w:eastAsia="Microsoft YaHei" w:hAnsi="Microsoft YaHei"/>
-                <w:b w:val="false"/>
-                <w:bCs w:val="false"/>
-                <w:sz w:val="18"/>
-                <w:szCs w:val="18"/>
-              </w:rPr>
-              <w:t xml:space="preserve">D-9-1</w:t>
-            </w:r>
-          </w:p>
-        </w:tc>
-        <w:tc>
-          <w:tcPr>
-            <w:tcW w:type="dxa" w:w="4207"/>
-            <w:tcBorders>
-              <w:top w:val="single" w:color="A6B8D0" w:sz="4"/>
-              <w:left w:val="single" w:color="A6B8D0" w:sz="4"/>
-              <w:bottom w:val="single" w:color="A6B8D0" w:sz="4"/>
-              <w:right w:val="single" w:color="A6B8D0" w:sz="4"/>
-            </w:tcBorders>
-            <w:tcMar>
-              <w:top w:type="dxa" w:w="50"/>
-              <w:left w:type="dxa" w:w="90"/>
-              <w:bottom w:type="dxa" w:w="50"/>
-              <w:right w:type="dxa" w:w="90"/>
-            </w:tcMar>
-          </w:tcPr>
-          <w:p>
-            <w:pPr>
-              <w:keepNext/>
-              <w:keepLines/>
-              <w:spacing w:after="0" w:before="0" w:line="280"/>
-            </w:pPr>
-            <w:r>
-              <w:rPr>
-                <w:rFonts w:ascii="Microsoft YaHei" w:eastAsia="Microsoft YaHei" w:hAnsi="Microsoft YaHei"/>
-                <w:b w:val="false"/>
-                <w:bCs w:val="false"/>
-                <w:sz w:val="18"/>
-                <w:szCs w:val="18"/>
-              </w:rPr>
-              <w:t xml:space="preserve">决定</w:t>
-            </w:r>
-          </w:p>
-        </w:tc>
-        <w:tc>
-          <w:tcPr>
-            <w:tcW w:type="dxa" w:w="4540"/>
-            <w:tcBorders>
-              <w:top w:val="single" w:color="A6B8D0" w:sz="4"/>
-              <w:left w:val="single" w:color="A6B8D0" w:sz="4"/>
-              <w:bottom w:val="single" w:color="A6B8D0" w:sz="4"/>
-              <w:right w:val="single" w:color="A6B8D0" w:sz="4"/>
-            </w:tcBorders>
-            <w:tcMar>
-              <w:top w:type="dxa" w:w="50"/>
-              <w:left w:type="dxa" w:w="90"/>
-              <w:bottom w:type="dxa" w:w="50"/>
-              <w:right w:type="dxa" w:w="90"/>
-            </w:tcMar>
-          </w:tcPr>
-          <w:p>
-            <w:pPr>
-              <w:keepNext/>
-              <w:keepLines/>
-              <w:spacing w:after="0" w:before="0" w:line="280"/>
-            </w:pPr>
-            <w:r>
-              <w:rPr>
-                <w:rFonts w:ascii="Microsoft YaHei" w:eastAsia="Microsoft YaHei" w:hAnsi="Microsoft YaHei"/>
-                <w:b w:val="false"/>
-                <w:bCs w:val="false"/>
-                <w:sz w:val="18"/>
-                <w:szCs w:val="18"/>
-              </w:rPr>
-              <w:t xml:space="preserve">权利人在销售时选择授予多大范围的权利</w:t>
+            <w:tcW w:type="dxa" w:w="908"/>
+            <w:tcBorders>
+              <w:top w:val="single" w:color="A6B8D0" w:sz="4"/>
+              <w:left w:val="single" w:color="A6B8D0" w:sz="4"/>
+              <w:bottom w:val="single" w:color="A6B8D0" w:sz="4"/>
+              <w:right w:val="single" w:color="A6B8D0" w:sz="4"/>
+            </w:tcBorders>
+            <w:tcMar>
+              <w:top w:type="dxa" w:w="50"/>
+              <w:left w:type="dxa" w:w="90"/>
+              <w:bottom w:type="dxa" w:w="50"/>
+              <w:right w:type="dxa" w:w="90"/>
+            </w:tcMar>
+          </w:tcPr>
+          <w:p>
+            <w:pPr>
+              <w:keepNext/>
+              <w:keepLines/>
+              <w:spacing w:after="0" w:before="0" w:line="280"/>
+            </w:pPr>
+            <w:r>
+              <w:rPr>
+                <w:rFonts w:ascii="Microsoft YaHei" w:eastAsia="Microsoft YaHei" w:hAnsi="Microsoft YaHei"/>
+                <w:b w:val="false"/>
+                <w:bCs w:val="false"/>
+                <w:sz w:val="18"/>
+                <w:szCs w:val="18"/>
+              </w:rPr>
+              <w:t xml:space="preserve">A-2</w:t>
+            </w:r>
+          </w:p>
+        </w:tc>
+        <w:tc>
+          <w:tcPr>
+            <w:tcW w:type="dxa" w:w="2686"/>
+            <w:tcBorders>
+              <w:top w:val="single" w:color="A6B8D0" w:sz="4"/>
+              <w:left w:val="single" w:color="A6B8D0" w:sz="4"/>
+              <w:bottom w:val="single" w:color="A6B8D0" w:sz="4"/>
+              <w:right w:val="single" w:color="A6B8D0" w:sz="4"/>
+            </w:tcBorders>
+            <w:tcMar>
+              <w:top w:type="dxa" w:w="50"/>
+              <w:left w:type="dxa" w:w="90"/>
+              <w:bottom w:type="dxa" w:w="50"/>
+              <w:right w:type="dxa" w:w="90"/>
+            </w:tcMar>
+          </w:tcPr>
+          <w:p>
+            <w:pPr>
+              <w:keepNext/>
+              <w:keepLines/>
+              <w:spacing w:after="0" w:before="0" w:line="280"/>
+            </w:pPr>
+            <w:r>
+              <w:rPr>
+                <w:rFonts w:ascii="Microsoft YaHei" w:eastAsia="Microsoft YaHei" w:hAnsi="Microsoft YaHei"/>
+                <w:b w:val="false"/>
+                <w:bCs w:val="false"/>
+                <w:sz w:val="18"/>
+                <w:szCs w:val="18"/>
+              </w:rPr>
+              <w:t xml:space="preserve">项目划分中发现的遗漏</w:t>
+            </w:r>
+          </w:p>
+        </w:tc>
+        <w:tc>
+          <w:tcPr>
+            <w:tcW w:type="dxa" w:w="6044"/>
+            <w:tcBorders>
+              <w:top w:val="single" w:color="A6B8D0" w:sz="4"/>
+              <w:left w:val="single" w:color="A6B8D0" w:sz="4"/>
+              <w:bottom w:val="single" w:color="A6B8D0" w:sz="4"/>
+              <w:right w:val="single" w:color="A6B8D0" w:sz="4"/>
+            </w:tcBorders>
+            <w:tcMar>
+              <w:top w:type="dxa" w:w="50"/>
+              <w:left w:type="dxa" w:w="90"/>
+              <w:bottom w:type="dxa" w:w="50"/>
+              <w:right w:type="dxa" w:w="90"/>
+            </w:tcMar>
+          </w:tcPr>
+          <w:p>
+            <w:pPr>
+              <w:keepNext/>
+              <w:keepLines/>
+              <w:spacing w:after="0" w:before="0" w:line="280"/>
+            </w:pPr>
+            <w:r>
+              <w:rPr>
+                <w:rFonts w:ascii="Microsoft YaHei" w:eastAsia="Microsoft YaHei" w:hAnsi="Microsoft YaHei"/>
+                <w:b w:val="false"/>
+                <w:bCs w:val="false"/>
+                <w:sz w:val="18"/>
+                <w:szCs w:val="18"/>
+              </w:rPr>
+              <w:t xml:space="preserve">支持声明的功能（声明是效力的前提，权利性的比对也依靠它）</w:t>
             </w:r>
           </w:p>
         </w:tc>
@@ -528,1137 +528,57 @@
         </w:trPr>
         <w:tc>
           <w:tcPr>
-            <w:tcW w:type="dxa" w:w="891"/>
-            <w:tcBorders>
-              <w:top w:val="single" w:color="A6B8D0" w:sz="4"/>
-              <w:left w:val="single" w:color="A6B8D0" w:sz="4"/>
-              <w:bottom w:val="single" w:color="A6B8D0" w:sz="4"/>
-              <w:right w:val="single" w:color="A6B8D0" w:sz="4"/>
-            </w:tcBorders>
-            <w:tcMar>
-              <w:top w:type="dxa" w:w="50"/>
-              <w:left w:type="dxa" w:w="90"/>
-              <w:bottom w:type="dxa" w:w="50"/>
-              <w:right w:type="dxa" w:w="90"/>
-            </w:tcMar>
-          </w:tcPr>
-          <w:p>
-            <w:pPr>
-              <w:keepNext/>
-              <w:keepLines/>
-              <w:spacing w:after="0" w:before="0" w:line="280"/>
-            </w:pPr>
-            <w:r>
-              <w:rPr>
-                <w:rFonts w:ascii="Microsoft YaHei" w:eastAsia="Microsoft YaHei" w:hAnsi="Microsoft YaHei"/>
-                <w:b w:val="false"/>
-                <w:bCs w:val="false"/>
-                <w:sz w:val="18"/>
-                <w:szCs w:val="18"/>
-              </w:rPr>
-              <w:t xml:space="preserve">D-9-2</w:t>
-            </w:r>
-          </w:p>
-        </w:tc>
-        <w:tc>
-          <w:tcPr>
-            <w:tcW w:type="dxa" w:w="4207"/>
-            <w:tcBorders>
-              <w:top w:val="single" w:color="A6B8D0" w:sz="4"/>
-              <w:left w:val="single" w:color="A6B8D0" w:sz="4"/>
-              <w:bottom w:val="single" w:color="A6B8D0" w:sz="4"/>
-              <w:right w:val="single" w:color="A6B8D0" w:sz="4"/>
-            </w:tcBorders>
-            <w:tcMar>
-              <w:top w:type="dxa" w:w="50"/>
-              <w:left w:type="dxa" w:w="90"/>
-              <w:bottom w:type="dxa" w:w="50"/>
-              <w:right w:type="dxa" w:w="90"/>
-            </w:tcMar>
-          </w:tcPr>
-          <w:p>
-            <w:pPr>
-              <w:keepNext/>
-              <w:keepLines/>
-              <w:spacing w:after="0" w:before="0" w:line="280"/>
-            </w:pPr>
-            <w:r>
-              <w:rPr>
-                <w:rFonts w:ascii="Microsoft YaHei" w:eastAsia="Microsoft YaHei" w:hAnsi="Microsoft YaHei"/>
-                <w:b w:val="false"/>
-                <w:bCs w:val="false"/>
-                <w:sz w:val="18"/>
-                <w:szCs w:val="18"/>
-              </w:rPr>
-              <w:t xml:space="preserve">决定</w:t>
-            </w:r>
-          </w:p>
-        </w:tc>
-        <w:tc>
-          <w:tcPr>
-            <w:tcW w:type="dxa" w:w="4540"/>
-            <w:tcBorders>
-              <w:top w:val="single" w:color="A6B8D0" w:sz="4"/>
-              <w:left w:val="single" w:color="A6B8D0" w:sz="4"/>
-              <w:bottom w:val="single" w:color="A6B8D0" w:sz="4"/>
-              <w:right w:val="single" w:color="A6B8D0" w:sz="4"/>
-            </w:tcBorders>
-            <w:tcMar>
-              <w:top w:type="dxa" w:w="50"/>
-              <w:left w:type="dxa" w:w="90"/>
-              <w:bottom w:type="dxa" w:w="50"/>
-              <w:right w:type="dxa" w:w="90"/>
-            </w:tcMar>
-          </w:tcPr>
-          <w:p>
-            <w:pPr>
-              <w:keepNext/>
-              <w:keepLines/>
-              <w:spacing w:after="0" w:before="0" w:line="280"/>
-            </w:pPr>
-            <w:r>
-              <w:rPr>
-                <w:rFonts w:ascii="Microsoft YaHei" w:eastAsia="Microsoft YaHei" w:hAnsi="Microsoft YaHei"/>
-                <w:b w:val="false"/>
-                <w:bCs w:val="false"/>
-                <w:sz w:val="18"/>
-                <w:szCs w:val="18"/>
-              </w:rPr>
-              <w:t xml:space="preserve">以销售时选择的许可范围，作为判断转载抵触了什么的基准</w:t>
-            </w:r>
-          </w:p>
-        </w:tc>
-      </w:tr>
-      <w:tr>
-        <w:trPr>
-          <w:cantSplit/>
-          <w:tblHeader w:val="off"/>
-        </w:trPr>
-        <w:tc>
-          <w:tcPr>
-            <w:tcW w:type="dxa" w:w="891"/>
-            <w:tcBorders>
-              <w:top w:val="single" w:color="A6B8D0" w:sz="4"/>
-              <w:left w:val="single" w:color="A6B8D0" w:sz="4"/>
-              <w:bottom w:val="single" w:color="A6B8D0" w:sz="4"/>
-              <w:right w:val="single" w:color="A6B8D0" w:sz="4"/>
-            </w:tcBorders>
-            <w:tcMar>
-              <w:top w:type="dxa" w:w="50"/>
-              <w:left w:type="dxa" w:w="90"/>
-              <w:bottom w:type="dxa" w:w="50"/>
-              <w:right w:type="dxa" w:w="90"/>
-            </w:tcMar>
-          </w:tcPr>
-          <w:p>
-            <w:pPr>
-              <w:keepNext/>
-              <w:keepLines/>
-              <w:spacing w:after="0" w:before="0" w:line="280"/>
-            </w:pPr>
-            <w:r>
-              <w:rPr>
-                <w:rFonts w:ascii="Microsoft YaHei" w:eastAsia="Microsoft YaHei" w:hAnsi="Microsoft YaHei"/>
-                <w:b w:val="false"/>
-                <w:bCs w:val="false"/>
-                <w:sz w:val="18"/>
-                <w:szCs w:val="18"/>
-              </w:rPr>
-              <w:t xml:space="preserve">D-9-3</w:t>
-            </w:r>
-          </w:p>
-        </w:tc>
-        <w:tc>
-          <w:tcPr>
-            <w:tcW w:type="dxa" w:w="4207"/>
-            <w:tcBorders>
-              <w:top w:val="single" w:color="A6B8D0" w:sz="4"/>
-              <w:left w:val="single" w:color="A6B8D0" w:sz="4"/>
-              <w:bottom w:val="single" w:color="A6B8D0" w:sz="4"/>
-              <w:right w:val="single" w:color="A6B8D0" w:sz="4"/>
-            </w:tcBorders>
-            <w:tcMar>
-              <w:top w:type="dxa" w:w="50"/>
-              <w:left w:type="dxa" w:w="90"/>
-              <w:bottom w:type="dxa" w:w="50"/>
-              <w:right w:type="dxa" w:w="90"/>
-            </w:tcMar>
-          </w:tcPr>
-          <w:p>
-            <w:pPr>
-              <w:keepNext/>
-              <w:keepLines/>
-              <w:spacing w:after="0" w:before="0" w:line="280"/>
-            </w:pPr>
-            <w:r>
-              <w:rPr>
-                <w:rFonts w:ascii="Microsoft YaHei" w:eastAsia="Microsoft YaHei" w:hAnsi="Microsoft YaHei"/>
-                <w:b w:val="false"/>
-                <w:bCs w:val="false"/>
-                <w:sz w:val="18"/>
-                <w:szCs w:val="18"/>
-              </w:rPr>
-              <w:t xml:space="preserve">决定</w:t>
-            </w:r>
-          </w:p>
-        </w:tc>
-        <w:tc>
-          <w:tcPr>
-            <w:tcW w:type="dxa" w:w="4540"/>
-            <w:tcBorders>
-              <w:top w:val="single" w:color="A6B8D0" w:sz="4"/>
-              <w:left w:val="single" w:color="A6B8D0" w:sz="4"/>
-              <w:bottom w:val="single" w:color="A6B8D0" w:sz="4"/>
-              <w:right w:val="single" w:color="A6B8D0" w:sz="4"/>
-            </w:tcBorders>
-            <w:tcMar>
-              <w:top w:type="dxa" w:w="50"/>
-              <w:left w:type="dxa" w:w="90"/>
-              <w:bottom w:type="dxa" w:w="50"/>
-              <w:right w:type="dxa" w:w="90"/>
-            </w:tcMar>
-          </w:tcPr>
-          <w:p>
-            <w:pPr>
-              <w:keepNext/>
-              <w:keepLines/>
-              <w:spacing w:after="0" w:before="0" w:line="280"/>
-            </w:pPr>
-            <w:r>
-              <w:rPr>
-                <w:rFonts w:ascii="Microsoft YaHei" w:eastAsia="Microsoft YaHei" w:hAnsi="Microsoft YaHei"/>
-                <w:b w:val="false"/>
-                <w:bCs w:val="false"/>
-                <w:sz w:val="18"/>
-                <w:szCs w:val="18"/>
-              </w:rPr>
-              <w:t xml:space="preserve">对交付用图片附上载明第9.2节所定事项的随附文件</w:t>
-            </w:r>
-          </w:p>
-        </w:tc>
-      </w:tr>
-      <w:tr>
-        <w:trPr>
-          <w:cantSplit/>
-          <w:tblHeader w:val="off"/>
-        </w:trPr>
-        <w:tc>
-          <w:tcPr>
-            <w:tcW w:type="dxa" w:w="891"/>
-            <w:tcBorders>
-              <w:top w:val="single" w:color="A6B8D0" w:sz="4"/>
-              <w:left w:val="single" w:color="A6B8D0" w:sz="4"/>
-              <w:bottom w:val="single" w:color="A6B8D0" w:sz="4"/>
-              <w:right w:val="single" w:color="A6B8D0" w:sz="4"/>
-            </w:tcBorders>
-            <w:tcMar>
-              <w:top w:type="dxa" w:w="50"/>
-              <w:left w:type="dxa" w:w="90"/>
-              <w:bottom w:type="dxa" w:w="50"/>
-              <w:right w:type="dxa" w:w="90"/>
-            </w:tcMar>
-          </w:tcPr>
-          <w:p>
-            <w:pPr>
-              <w:keepNext/>
-              <w:keepLines/>
-              <w:spacing w:after="0" w:before="0" w:line="280"/>
-            </w:pPr>
-            <w:r>
-              <w:rPr>
-                <w:rFonts w:ascii="Microsoft YaHei" w:eastAsia="Microsoft YaHei" w:hAnsi="Microsoft YaHei"/>
-                <w:b w:val="false"/>
-                <w:bCs w:val="false"/>
-                <w:sz w:val="18"/>
-                <w:szCs w:val="18"/>
-              </w:rPr>
-              <w:t xml:space="preserve">D-9-4</w:t>
-            </w:r>
-          </w:p>
-        </w:tc>
-        <w:tc>
-          <w:tcPr>
-            <w:tcW w:type="dxa" w:w="4207"/>
-            <w:tcBorders>
-              <w:top w:val="single" w:color="A6B8D0" w:sz="4"/>
-              <w:left w:val="single" w:color="A6B8D0" w:sz="4"/>
-              <w:bottom w:val="single" w:color="A6B8D0" w:sz="4"/>
-              <w:right w:val="single" w:color="A6B8D0" w:sz="4"/>
-            </w:tcBorders>
-            <w:tcMar>
-              <w:top w:type="dxa" w:w="50"/>
-              <w:left w:type="dxa" w:w="90"/>
-              <w:bottom w:type="dxa" w:w="50"/>
-              <w:right w:type="dxa" w:w="90"/>
-            </w:tcMar>
-          </w:tcPr>
-          <w:p>
-            <w:pPr>
-              <w:keepNext/>
-              <w:keepLines/>
-              <w:spacing w:after="0" w:before="0" w:line="280"/>
-            </w:pPr>
-            <w:r>
-              <w:rPr>
-                <w:rFonts w:ascii="Microsoft YaHei" w:eastAsia="Microsoft YaHei" w:hAnsi="Microsoft YaHei"/>
-                <w:b w:val="false"/>
-                <w:bCs w:val="false"/>
-                <w:sz w:val="18"/>
-                <w:szCs w:val="18"/>
-              </w:rPr>
-              <w:t xml:space="preserve">决定</w:t>
-            </w:r>
-          </w:p>
-        </w:tc>
-        <w:tc>
-          <w:tcPr>
-            <w:tcW w:type="dxa" w:w="4540"/>
-            <w:tcBorders>
-              <w:top w:val="single" w:color="A6B8D0" w:sz="4"/>
-              <w:left w:val="single" w:color="A6B8D0" w:sz="4"/>
-              <w:bottom w:val="single" w:color="A6B8D0" w:sz="4"/>
-              <w:right w:val="single" w:color="A6B8D0" w:sz="4"/>
-            </w:tcBorders>
-            <w:tcMar>
-              <w:top w:type="dxa" w:w="50"/>
-              <w:left w:type="dxa" w:w="90"/>
-              <w:bottom w:type="dxa" w:w="50"/>
-              <w:right w:type="dxa" w:w="90"/>
-            </w:tcMar>
-          </w:tcPr>
-          <w:p>
-            <w:pPr>
-              <w:keepNext/>
-              <w:keepLines/>
-              <w:spacing w:after="0" w:before="0" w:line="280"/>
-            </w:pPr>
-            <w:r>
-              <w:rPr>
-                <w:rFonts w:ascii="Microsoft YaHei" w:eastAsia="Microsoft YaHei" w:hAnsi="Microsoft YaHei"/>
-                <w:b w:val="false"/>
-                <w:bCs w:val="false"/>
-                <w:sz w:val="18"/>
-                <w:szCs w:val="18"/>
-              </w:rPr>
-              <w:t xml:space="preserve">随附文件中加入不得擅自将图片转交他人的一句话。其缺失并非权利人的过失所致</w:t>
-            </w:r>
-          </w:p>
-        </w:tc>
-      </w:tr>
-      <w:tr>
-        <w:trPr>
-          <w:cantSplit/>
-          <w:tblHeader w:val="off"/>
-        </w:trPr>
-        <w:tc>
-          <w:tcPr>
-            <w:tcW w:type="dxa" w:w="891"/>
-            <w:tcBorders>
-              <w:top w:val="single" w:color="A6B8D0" w:sz="4"/>
-              <w:left w:val="single" w:color="A6B8D0" w:sz="4"/>
-              <w:bottom w:val="single" w:color="A6B8D0" w:sz="4"/>
-              <w:right w:val="single" w:color="A6B8D0" w:sz="4"/>
-            </w:tcBorders>
-            <w:tcMar>
-              <w:top w:type="dxa" w:w="50"/>
-              <w:left w:type="dxa" w:w="90"/>
-              <w:bottom w:type="dxa" w:w="50"/>
-              <w:right w:type="dxa" w:w="90"/>
-            </w:tcMar>
-          </w:tcPr>
-          <w:p>
-            <w:pPr>
-              <w:keepNext/>
-              <w:keepLines/>
-              <w:spacing w:after="0" w:before="0" w:line="280"/>
-            </w:pPr>
-            <w:r>
-              <w:rPr>
-                <w:rFonts w:ascii="Microsoft YaHei" w:eastAsia="Microsoft YaHei" w:hAnsi="Microsoft YaHei"/>
-                <w:b w:val="false"/>
-                <w:bCs w:val="false"/>
-                <w:sz w:val="18"/>
-                <w:szCs w:val="18"/>
-              </w:rPr>
-              <w:t xml:space="preserve">D-9-5</w:t>
-            </w:r>
-          </w:p>
-        </w:tc>
-        <w:tc>
-          <w:tcPr>
-            <w:tcW w:type="dxa" w:w="4207"/>
-            <w:tcBorders>
-              <w:top w:val="single" w:color="A6B8D0" w:sz="4"/>
-              <w:left w:val="single" w:color="A6B8D0" w:sz="4"/>
-              <w:bottom w:val="single" w:color="A6B8D0" w:sz="4"/>
-              <w:right w:val="single" w:color="A6B8D0" w:sz="4"/>
-            </w:tcBorders>
-            <w:tcMar>
-              <w:top w:type="dxa" w:w="50"/>
-              <w:left w:type="dxa" w:w="90"/>
-              <w:bottom w:type="dxa" w:w="50"/>
-              <w:right w:type="dxa" w:w="90"/>
-            </w:tcMar>
-          </w:tcPr>
-          <w:p>
-            <w:pPr>
-              <w:keepNext/>
-              <w:keepLines/>
-              <w:spacing w:after="0" w:before="0" w:line="280"/>
-            </w:pPr>
-            <w:r>
-              <w:rPr>
-                <w:rFonts w:ascii="Microsoft YaHei" w:eastAsia="Microsoft YaHei" w:hAnsi="Microsoft YaHei"/>
-                <w:b w:val="false"/>
-                <w:bCs w:val="false"/>
-                <w:sz w:val="18"/>
-                <w:szCs w:val="18"/>
-              </w:rPr>
-              <w:t xml:space="preserve">决定</w:t>
-            </w:r>
-          </w:p>
-        </w:tc>
-        <w:tc>
-          <w:tcPr>
-            <w:tcW w:type="dxa" w:w="4540"/>
-            <w:tcBorders>
-              <w:top w:val="single" w:color="A6B8D0" w:sz="4"/>
-              <w:left w:val="single" w:color="A6B8D0" w:sz="4"/>
-              <w:bottom w:val="single" w:color="A6B8D0" w:sz="4"/>
-              <w:right w:val="single" w:color="A6B8D0" w:sz="4"/>
-            </w:tcBorders>
-            <w:tcMar>
-              <w:top w:type="dxa" w:w="50"/>
-              <w:left w:type="dxa" w:w="90"/>
-              <w:bottom w:type="dxa" w:w="50"/>
-              <w:right w:type="dxa" w:w="90"/>
-            </w:tcMar>
-          </w:tcPr>
-          <w:p>
-            <w:pPr>
-              <w:keepNext/>
-              <w:keepLines/>
-              <w:spacing w:after="0" w:before="0" w:line="280"/>
-            </w:pPr>
-            <w:r>
-              <w:rPr>
-                <w:rFonts w:ascii="Microsoft YaHei" w:eastAsia="Microsoft YaHei" w:hAnsi="Microsoft YaHei"/>
-                <w:b w:val="false"/>
-                <w:bCs w:val="false"/>
-                <w:sz w:val="18"/>
-                <w:szCs w:val="18"/>
-              </w:rPr>
-              <w:t xml:space="preserve">将涵盖所有国家的信息作为链接目标公开，仅对购买者中常见的国籍附上文本文稿</w:t>
-            </w:r>
-          </w:p>
-        </w:tc>
-      </w:tr>
-      <w:tr>
-        <w:trPr>
-          <w:cantSplit/>
-          <w:tblHeader w:val="off"/>
-        </w:trPr>
-        <w:tc>
-          <w:tcPr>
-            <w:tcW w:type="dxa" w:w="891"/>
-            <w:tcBorders>
-              <w:top w:val="single" w:color="A6B8D0" w:sz="4"/>
-              <w:left w:val="single" w:color="A6B8D0" w:sz="4"/>
-              <w:bottom w:val="single" w:color="A6B8D0" w:sz="4"/>
-              <w:right w:val="single" w:color="A6B8D0" w:sz="4"/>
-            </w:tcBorders>
-            <w:tcMar>
-              <w:top w:type="dxa" w:w="50"/>
-              <w:left w:type="dxa" w:w="90"/>
-              <w:bottom w:type="dxa" w:w="50"/>
-              <w:right w:type="dxa" w:w="90"/>
-            </w:tcMar>
-          </w:tcPr>
-          <w:p>
-            <w:pPr>
-              <w:keepNext/>
-              <w:keepLines/>
-              <w:spacing w:after="0" w:before="0" w:line="280"/>
-            </w:pPr>
-            <w:r>
-              <w:rPr>
-                <w:rFonts w:ascii="Microsoft YaHei" w:eastAsia="Microsoft YaHei" w:hAnsi="Microsoft YaHei"/>
-                <w:b w:val="false"/>
-                <w:bCs w:val="false"/>
-                <w:sz w:val="18"/>
-                <w:szCs w:val="18"/>
-              </w:rPr>
-              <w:t xml:space="preserve">D-9-6</w:t>
-            </w:r>
-          </w:p>
-        </w:tc>
-        <w:tc>
-          <w:tcPr>
-            <w:tcW w:type="dxa" w:w="4207"/>
-            <w:tcBorders>
-              <w:top w:val="single" w:color="A6B8D0" w:sz="4"/>
-              <w:left w:val="single" w:color="A6B8D0" w:sz="4"/>
-              <w:bottom w:val="single" w:color="A6B8D0" w:sz="4"/>
-              <w:right w:val="single" w:color="A6B8D0" w:sz="4"/>
-            </w:tcBorders>
-            <w:tcMar>
-              <w:top w:type="dxa" w:w="50"/>
-              <w:left w:type="dxa" w:w="90"/>
-              <w:bottom w:type="dxa" w:w="50"/>
-              <w:right w:type="dxa" w:w="90"/>
-            </w:tcMar>
-          </w:tcPr>
-          <w:p>
-            <w:pPr>
-              <w:keepNext/>
-              <w:keepLines/>
-              <w:spacing w:after="0" w:before="0" w:line="280"/>
-            </w:pPr>
-            <w:r>
-              <w:rPr>
-                <w:rFonts w:ascii="Microsoft YaHei" w:eastAsia="Microsoft YaHei" w:hAnsi="Microsoft YaHei"/>
-                <w:b w:val="false"/>
-                <w:bCs w:val="false"/>
-                <w:sz w:val="18"/>
-                <w:szCs w:val="18"/>
-              </w:rPr>
-              <w:t xml:space="preserve">决定</w:t>
-            </w:r>
-          </w:p>
-        </w:tc>
-        <w:tc>
-          <w:tcPr>
-            <w:tcW w:type="dxa" w:w="4540"/>
-            <w:tcBorders>
-              <w:top w:val="single" w:color="A6B8D0" w:sz="4"/>
-              <w:left w:val="single" w:color="A6B8D0" w:sz="4"/>
-              <w:bottom w:val="single" w:color="A6B8D0" w:sz="4"/>
-              <w:right w:val="single" w:color="A6B8D0" w:sz="4"/>
-            </w:tcBorders>
-            <w:tcMar>
-              <w:top w:type="dxa" w:w="50"/>
-              <w:left w:type="dxa" w:w="90"/>
-              <w:bottom w:type="dxa" w:w="50"/>
-              <w:right w:type="dxa" w:w="90"/>
-            </w:tcMar>
-          </w:tcPr>
-          <w:p>
-            <w:pPr>
-              <w:keepNext/>
-              <w:keepLines/>
-              <w:spacing w:after="0" w:before="0" w:line="280"/>
-            </w:pPr>
-            <w:r>
-              <w:rPr>
-                <w:rFonts w:ascii="Microsoft YaHei" w:eastAsia="Microsoft YaHei" w:hAnsi="Microsoft YaHei"/>
-                <w:b w:val="false"/>
-                <w:bCs w:val="false"/>
-                <w:sz w:val="18"/>
-                <w:szCs w:val="18"/>
-              </w:rPr>
-              <w:t xml:space="preserve">追究的对象为违法者，不问其是否为购买者</w:t>
-            </w:r>
-          </w:p>
-        </w:tc>
-      </w:tr>
-      <w:tr>
-        <w:trPr>
-          <w:cantSplit/>
-          <w:tblHeader w:val="off"/>
-        </w:trPr>
-        <w:tc>
-          <w:tcPr>
-            <w:tcW w:type="dxa" w:w="891"/>
-            <w:tcBorders>
-              <w:top w:val="single" w:color="A6B8D0" w:sz="4"/>
-              <w:left w:val="single" w:color="A6B8D0" w:sz="4"/>
-              <w:bottom w:val="single" w:color="A6B8D0" w:sz="4"/>
-              <w:right w:val="single" w:color="A6B8D0" w:sz="4"/>
-            </w:tcBorders>
-            <w:tcMar>
-              <w:top w:type="dxa" w:w="50"/>
-              <w:left w:type="dxa" w:w="90"/>
-              <w:bottom w:type="dxa" w:w="50"/>
-              <w:right w:type="dxa" w:w="90"/>
-            </w:tcMar>
-          </w:tcPr>
-          <w:p>
-            <w:pPr>
-              <w:keepNext/>
-              <w:keepLines/>
-              <w:spacing w:after="0" w:before="0" w:line="280"/>
-            </w:pPr>
-            <w:r>
-              <w:rPr>
-                <w:rFonts w:ascii="Microsoft YaHei" w:eastAsia="Microsoft YaHei" w:hAnsi="Microsoft YaHei"/>
-                <w:b w:val="false"/>
-                <w:bCs w:val="false"/>
-                <w:sz w:val="18"/>
-                <w:szCs w:val="18"/>
-              </w:rPr>
-              <w:t xml:space="preserve">I-06</w:t>
-            </w:r>
-          </w:p>
-        </w:tc>
-        <w:tc>
-          <w:tcPr>
-            <w:tcW w:type="dxa" w:w="4207"/>
-            <w:tcBorders>
-              <w:top w:val="single" w:color="A6B8D0" w:sz="4"/>
-              <w:left w:val="single" w:color="A6B8D0" w:sz="4"/>
-              <w:bottom w:val="single" w:color="A6B8D0" w:sz="4"/>
-              <w:right w:val="single" w:color="A6B8D0" w:sz="4"/>
-            </w:tcBorders>
-            <w:tcMar>
-              <w:top w:type="dxa" w:w="50"/>
-              <w:left w:type="dxa" w:w="90"/>
-              <w:bottom w:type="dxa" w:w="50"/>
-              <w:right w:type="dxa" w:w="90"/>
-            </w:tcMar>
-          </w:tcPr>
-          <w:p>
-            <w:pPr>
-              <w:keepNext/>
-              <w:keepLines/>
-              <w:spacing w:after="0" w:before="0" w:line="280"/>
-            </w:pPr>
-            <w:r>
-              <w:rPr>
-                <w:rFonts w:ascii="Microsoft YaHei" w:eastAsia="Microsoft YaHei" w:hAnsi="Microsoft YaHei"/>
-                <w:b w:val="false"/>
-                <w:bCs w:val="false"/>
-                <w:sz w:val="18"/>
-                <w:szCs w:val="18"/>
-              </w:rPr>
-              <w:t xml:space="preserve">待调查</w:t>
-            </w:r>
-          </w:p>
-        </w:tc>
-        <w:tc>
-          <w:tcPr>
-            <w:tcW w:type="dxa" w:w="4540"/>
-            <w:tcBorders>
-              <w:top w:val="single" w:color="A6B8D0" w:sz="4"/>
-              <w:left w:val="single" w:color="A6B8D0" w:sz="4"/>
-              <w:bottom w:val="single" w:color="A6B8D0" w:sz="4"/>
-              <w:right w:val="single" w:color="A6B8D0" w:sz="4"/>
-            </w:tcBorders>
-            <w:tcMar>
-              <w:top w:type="dxa" w:w="50"/>
-              <w:left w:type="dxa" w:w="90"/>
-              <w:bottom w:type="dxa" w:w="50"/>
-              <w:right w:type="dxa" w:w="90"/>
-            </w:tcMar>
-          </w:tcPr>
-          <w:p>
-            <w:pPr>
-              <w:keepNext/>
-              <w:keepLines/>
-              <w:spacing w:after="0" w:before="0" w:line="280"/>
-            </w:pPr>
-            <w:r>
-              <w:rPr>
-                <w:rFonts w:ascii="Microsoft YaHei" w:eastAsia="Microsoft YaHei" w:hAnsi="Microsoft YaHei"/>
-                <w:b w:val="false"/>
-                <w:bCs w:val="false"/>
-                <w:sz w:val="18"/>
-                <w:szCs w:val="18"/>
-              </w:rPr>
-              <w:t xml:space="preserve">各国权利的差异</w:t>
-            </w:r>
-          </w:p>
-        </w:tc>
-      </w:tr>
-      <w:tr>
-        <w:trPr>
-          <w:cantSplit/>
-          <w:tblHeader w:val="off"/>
-        </w:trPr>
-        <w:tc>
-          <w:tcPr>
-            <w:tcW w:type="dxa" w:w="891"/>
-            <w:tcBorders>
-              <w:top w:val="single" w:color="A6B8D0" w:sz="4"/>
-              <w:left w:val="single" w:color="A6B8D0" w:sz="4"/>
-              <w:bottom w:val="single" w:color="A6B8D0" w:sz="4"/>
-              <w:right w:val="single" w:color="A6B8D0" w:sz="4"/>
-            </w:tcBorders>
-            <w:tcMar>
-              <w:top w:type="dxa" w:w="50"/>
-              <w:left w:type="dxa" w:w="90"/>
-              <w:bottom w:type="dxa" w:w="50"/>
-              <w:right w:type="dxa" w:w="90"/>
-            </w:tcMar>
-          </w:tcPr>
-          <w:p>
-            <w:pPr>
-              <w:keepNext/>
-              <w:keepLines/>
-              <w:spacing w:after="0" w:before="0" w:line="280"/>
-            </w:pPr>
-            <w:r>
-              <w:rPr>
-                <w:rFonts w:ascii="Microsoft YaHei" w:eastAsia="Microsoft YaHei" w:hAnsi="Microsoft YaHei"/>
-                <w:b w:val="false"/>
-                <w:bCs w:val="false"/>
-                <w:sz w:val="18"/>
-                <w:szCs w:val="18"/>
-              </w:rPr>
-              <w:t xml:space="preserve">I-07</w:t>
-            </w:r>
-          </w:p>
-        </w:tc>
-        <w:tc>
-          <w:tcPr>
-            <w:tcW w:type="dxa" w:w="4207"/>
-            <w:tcBorders>
-              <w:top w:val="single" w:color="A6B8D0" w:sz="4"/>
-              <w:left w:val="single" w:color="A6B8D0" w:sz="4"/>
-              <w:bottom w:val="single" w:color="A6B8D0" w:sz="4"/>
-              <w:right w:val="single" w:color="A6B8D0" w:sz="4"/>
-            </w:tcBorders>
-            <w:tcMar>
-              <w:top w:type="dxa" w:w="50"/>
-              <w:left w:type="dxa" w:w="90"/>
-              <w:bottom w:type="dxa" w:w="50"/>
-              <w:right w:type="dxa" w:w="90"/>
-            </w:tcMar>
-          </w:tcPr>
-          <w:p>
-            <w:pPr>
-              <w:keepNext/>
-              <w:keepLines/>
-              <w:spacing w:after="0" w:before="0" w:line="280"/>
-            </w:pPr>
-            <w:r>
-              <w:rPr>
-                <w:rFonts w:ascii="Microsoft YaHei" w:eastAsia="Microsoft YaHei" w:hAnsi="Microsoft YaHei"/>
-                <w:b w:val="false"/>
-                <w:bCs w:val="false"/>
-                <w:sz w:val="18"/>
-                <w:szCs w:val="18"/>
-              </w:rPr>
-              <w:t xml:space="preserve">待调查</w:t>
-            </w:r>
-          </w:p>
-        </w:tc>
-        <w:tc>
-          <w:tcPr>
-            <w:tcW w:type="dxa" w:w="4540"/>
-            <w:tcBorders>
-              <w:top w:val="single" w:color="A6B8D0" w:sz="4"/>
-              <w:left w:val="single" w:color="A6B8D0" w:sz="4"/>
-              <w:bottom w:val="single" w:color="A6B8D0" w:sz="4"/>
-              <w:right w:val="single" w:color="A6B8D0" w:sz="4"/>
-            </w:tcBorders>
-            <w:tcMar>
-              <w:top w:type="dxa" w:w="50"/>
-              <w:left w:type="dxa" w:w="90"/>
-              <w:bottom w:type="dxa" w:w="50"/>
-              <w:right w:type="dxa" w:w="90"/>
-            </w:tcMar>
-          </w:tcPr>
-          <w:p>
-            <w:pPr>
-              <w:keepNext/>
-              <w:keepLines/>
-              <w:spacing w:after="0" w:before="0" w:line="280"/>
-            </w:pPr>
-            <w:r>
-              <w:rPr>
-                <w:rFonts w:ascii="Microsoft YaHei" w:eastAsia="Microsoft YaHei" w:hAnsi="Microsoft YaHei"/>
-                <w:b w:val="false"/>
-                <w:bCs w:val="false"/>
-                <w:sz w:val="18"/>
-                <w:szCs w:val="18"/>
-              </w:rPr>
-              <w:t xml:space="preserve">购买者国家的掌握</w:t>
-            </w:r>
-          </w:p>
-        </w:tc>
-      </w:tr>
-      <w:tr>
-        <w:trPr>
-          <w:cantSplit/>
-          <w:tblHeader w:val="off"/>
-        </w:trPr>
-        <w:tc>
-          <w:tcPr>
-            <w:tcW w:type="dxa" w:w="891"/>
-            <w:tcBorders>
-              <w:top w:val="single" w:color="A6B8D0" w:sz="4"/>
-              <w:left w:val="single" w:color="A6B8D0" w:sz="4"/>
-              <w:bottom w:val="single" w:color="A6B8D0" w:sz="4"/>
-              <w:right w:val="single" w:color="A6B8D0" w:sz="4"/>
-            </w:tcBorders>
-            <w:tcMar>
-              <w:top w:type="dxa" w:w="50"/>
-              <w:left w:type="dxa" w:w="90"/>
-              <w:bottom w:type="dxa" w:w="50"/>
-              <w:right w:type="dxa" w:w="90"/>
-            </w:tcMar>
-          </w:tcPr>
-          <w:p>
-            <w:pPr>
-              <w:keepNext/>
-              <w:keepLines/>
-              <w:spacing w:after="0" w:before="0" w:line="280"/>
-            </w:pPr>
-            <w:r>
-              <w:rPr>
-                <w:rFonts w:ascii="Microsoft YaHei" w:eastAsia="Microsoft YaHei" w:hAnsi="Microsoft YaHei"/>
-                <w:b w:val="false"/>
-                <w:bCs w:val="false"/>
-                <w:sz w:val="18"/>
-                <w:szCs w:val="18"/>
-              </w:rPr>
-              <w:t xml:space="preserve">I-08</w:t>
-            </w:r>
-          </w:p>
-        </w:tc>
-        <w:tc>
-          <w:tcPr>
-            <w:tcW w:type="dxa" w:w="4207"/>
-            <w:tcBorders>
-              <w:top w:val="single" w:color="A6B8D0" w:sz="4"/>
-              <w:left w:val="single" w:color="A6B8D0" w:sz="4"/>
-              <w:bottom w:val="single" w:color="A6B8D0" w:sz="4"/>
-              <w:right w:val="single" w:color="A6B8D0" w:sz="4"/>
-            </w:tcBorders>
-            <w:tcMar>
-              <w:top w:type="dxa" w:w="50"/>
-              <w:left w:type="dxa" w:w="90"/>
-              <w:bottom w:type="dxa" w:w="50"/>
-              <w:right w:type="dxa" w:w="90"/>
-            </w:tcMar>
-          </w:tcPr>
-          <w:p>
-            <w:pPr>
-              <w:keepNext/>
-              <w:keepLines/>
-              <w:spacing w:after="0" w:before="0" w:line="280"/>
-            </w:pPr>
-            <w:r>
-              <w:rPr>
-                <w:rFonts w:ascii="Microsoft YaHei" w:eastAsia="Microsoft YaHei" w:hAnsi="Microsoft YaHei"/>
-                <w:b w:val="false"/>
-                <w:bCs w:val="false"/>
-                <w:sz w:val="18"/>
-                <w:szCs w:val="18"/>
-              </w:rPr>
-              <w:t xml:space="preserve">待调查</w:t>
-            </w:r>
-          </w:p>
-        </w:tc>
-        <w:tc>
-          <w:tcPr>
-            <w:tcW w:type="dxa" w:w="4540"/>
-            <w:tcBorders>
-              <w:top w:val="single" w:color="A6B8D0" w:sz="4"/>
-              <w:left w:val="single" w:color="A6B8D0" w:sz="4"/>
-              <w:bottom w:val="single" w:color="A6B8D0" w:sz="4"/>
-              <w:right w:val="single" w:color="A6B8D0" w:sz="4"/>
-            </w:tcBorders>
-            <w:tcMar>
-              <w:top w:type="dxa" w:w="50"/>
-              <w:left w:type="dxa" w:w="90"/>
-              <w:bottom w:type="dxa" w:w="50"/>
-              <w:right w:type="dxa" w:w="90"/>
-            </w:tcMar>
-          </w:tcPr>
-          <w:p>
-            <w:pPr>
-              <w:keepNext/>
-              <w:keepLines/>
-              <w:spacing w:after="0" w:before="0" w:line="280"/>
-            </w:pPr>
-            <w:r>
-              <w:rPr>
-                <w:rFonts w:ascii="Microsoft YaHei" w:eastAsia="Microsoft YaHei" w:hAnsi="Microsoft YaHei"/>
-                <w:b w:val="false"/>
-                <w:bCs w:val="false"/>
-                <w:sz w:val="18"/>
-                <w:szCs w:val="18"/>
-              </w:rPr>
-              <w:t xml:space="preserve">权利文书的措辞</w:t>
-            </w:r>
-          </w:p>
-        </w:tc>
-      </w:tr>
-      <w:tr>
-        <w:trPr>
-          <w:cantSplit/>
-          <w:tblHeader w:val="off"/>
-        </w:trPr>
-        <w:tc>
-          <w:tcPr>
-            <w:tcW w:type="dxa" w:w="891"/>
-            <w:tcBorders>
-              <w:top w:val="single" w:color="A6B8D0" w:sz="4"/>
-              <w:left w:val="single" w:color="A6B8D0" w:sz="4"/>
-              <w:bottom w:val="single" w:color="A6B8D0" w:sz="4"/>
-              <w:right w:val="single" w:color="A6B8D0" w:sz="4"/>
-            </w:tcBorders>
-            <w:tcMar>
-              <w:top w:type="dxa" w:w="50"/>
-              <w:left w:type="dxa" w:w="90"/>
-              <w:bottom w:type="dxa" w:w="50"/>
-              <w:right w:type="dxa" w:w="90"/>
-            </w:tcMar>
-          </w:tcPr>
-          <w:p>
-            <w:pPr>
-              <w:keepNext/>
-              <w:keepLines/>
-              <w:spacing w:after="0" w:before="0" w:line="280"/>
-            </w:pPr>
-            <w:r>
-              <w:rPr>
-                <w:rFonts w:ascii="Microsoft YaHei" w:eastAsia="Microsoft YaHei" w:hAnsi="Microsoft YaHei"/>
-                <w:b w:val="false"/>
-                <w:bCs w:val="false"/>
-                <w:sz w:val="18"/>
-                <w:szCs w:val="18"/>
-              </w:rPr>
-              <w:t xml:space="preserve">O-03</w:t>
-            </w:r>
-          </w:p>
-        </w:tc>
-        <w:tc>
-          <w:tcPr>
-            <w:tcW w:type="dxa" w:w="4207"/>
-            <w:tcBorders>
-              <w:top w:val="single" w:color="A6B8D0" w:sz="4"/>
-              <w:left w:val="single" w:color="A6B8D0" w:sz="4"/>
-              <w:bottom w:val="single" w:color="A6B8D0" w:sz="4"/>
-              <w:right w:val="single" w:color="A6B8D0" w:sz="4"/>
-            </w:tcBorders>
-            <w:tcMar>
-              <w:top w:type="dxa" w:w="50"/>
-              <w:left w:type="dxa" w:w="90"/>
-              <w:bottom w:type="dxa" w:w="50"/>
-              <w:right w:type="dxa" w:w="90"/>
-            </w:tcMar>
-          </w:tcPr>
-          <w:p>
-            <w:pPr>
-              <w:keepNext/>
-              <w:keepLines/>
-              <w:spacing w:after="0" w:before="0" w:line="280"/>
-            </w:pPr>
-            <w:r>
-              <w:rPr>
-                <w:rFonts w:ascii="Microsoft YaHei" w:eastAsia="Microsoft YaHei" w:hAnsi="Microsoft YaHei"/>
-                <w:b w:val="false"/>
-                <w:bCs w:val="false"/>
-                <w:sz w:val="18"/>
-                <w:szCs w:val="18"/>
-              </w:rPr>
-              <w:t xml:space="preserve">未决（在基本设计 第5章 3.5“法律上的定位（在法务中处理）”中放置了方案。采用与否取决于专家的确认）</w:t>
-            </w:r>
-          </w:p>
-        </w:tc>
-        <w:tc>
-          <w:tcPr>
-            <w:tcW w:type="dxa" w:w="4540"/>
-            <w:tcBorders>
-              <w:top w:val="single" w:color="A6B8D0" w:sz="4"/>
-              <w:left w:val="single" w:color="A6B8D0" w:sz="4"/>
-              <w:bottom w:val="single" w:color="A6B8D0" w:sz="4"/>
-              <w:right w:val="single" w:color="A6B8D0" w:sz="4"/>
-            </w:tcBorders>
-            <w:tcMar>
-              <w:top w:type="dxa" w:w="50"/>
-              <w:left w:type="dxa" w:w="90"/>
-              <w:bottom w:type="dxa" w:w="50"/>
-              <w:right w:type="dxa" w:w="90"/>
-            </w:tcMar>
-          </w:tcPr>
-          <w:p>
-            <w:pPr>
-              <w:keepNext/>
-              <w:keepLines/>
-              <w:spacing w:after="0" w:before="0" w:line="280"/>
-            </w:pPr>
-            <w:r>
-              <w:rPr>
-                <w:rFonts w:ascii="Microsoft YaHei" w:eastAsia="Microsoft YaHei" w:hAnsi="Microsoft YaHei"/>
-                <w:b w:val="false"/>
-                <w:bCs w:val="false"/>
-                <w:sz w:val="18"/>
-                <w:szCs w:val="18"/>
-              </w:rPr>
-              <w:t xml:space="preserve">准据法的思路</w:t>
-            </w:r>
-          </w:p>
-        </w:tc>
-      </w:tr>
-      <w:tr>
-        <w:trPr>
-          <w:cantSplit/>
-          <w:tblHeader w:val="off"/>
-        </w:trPr>
-        <w:tc>
-          <w:tcPr>
-            <w:tcW w:type="dxa" w:w="891"/>
-            <w:tcBorders>
-              <w:top w:val="single" w:color="A6B8D0" w:sz="4"/>
-              <w:left w:val="single" w:color="A6B8D0" w:sz="4"/>
-              <w:bottom w:val="single" w:color="A6B8D0" w:sz="4"/>
-              <w:right w:val="single" w:color="A6B8D0" w:sz="4"/>
-            </w:tcBorders>
-            <w:tcMar>
-              <w:top w:type="dxa" w:w="50"/>
-              <w:left w:type="dxa" w:w="90"/>
-              <w:bottom w:type="dxa" w:w="50"/>
-              <w:right w:type="dxa" w:w="90"/>
-            </w:tcMar>
-          </w:tcPr>
-          <w:p>
-            <w:pPr>
-              <w:keepNext/>
-              <w:keepLines/>
-              <w:spacing w:after="0" w:before="0" w:line="280"/>
-            </w:pPr>
-            <w:r>
-              <w:rPr>
-                <w:rFonts w:ascii="Microsoft YaHei" w:eastAsia="Microsoft YaHei" w:hAnsi="Microsoft YaHei"/>
-                <w:b w:val="false"/>
-                <w:bCs w:val="false"/>
-                <w:sz w:val="18"/>
-                <w:szCs w:val="18"/>
-              </w:rPr>
-              <w:t xml:space="preserve">O-04</w:t>
-            </w:r>
-          </w:p>
-        </w:tc>
-        <w:tc>
-          <w:tcPr>
-            <w:tcW w:type="dxa" w:w="4207"/>
-            <w:tcBorders>
-              <w:top w:val="single" w:color="A6B8D0" w:sz="4"/>
-              <w:left w:val="single" w:color="A6B8D0" w:sz="4"/>
-              <w:bottom w:val="single" w:color="A6B8D0" w:sz="4"/>
-              <w:right w:val="single" w:color="A6B8D0" w:sz="4"/>
-            </w:tcBorders>
-            <w:tcMar>
-              <w:top w:type="dxa" w:w="50"/>
-              <w:left w:type="dxa" w:w="90"/>
-              <w:bottom w:type="dxa" w:w="50"/>
-              <w:right w:type="dxa" w:w="90"/>
-            </w:tcMar>
-          </w:tcPr>
-          <w:p>
-            <w:pPr>
-              <w:keepNext/>
-              <w:keepLines/>
-              <w:spacing w:after="0" w:before="0" w:line="280"/>
-            </w:pPr>
-            <w:r>
-              <w:rPr>
-                <w:rFonts w:ascii="Microsoft YaHei" w:eastAsia="Microsoft YaHei" w:hAnsi="Microsoft YaHei"/>
-                <w:b w:val="false"/>
-                <w:bCs w:val="false"/>
-                <w:sz w:val="18"/>
-                <w:szCs w:val="18"/>
-              </w:rPr>
-              <w:t xml:space="preserve">未决（在基本设计 第5章 2.1“选项（O-04“许可范围的选项”的决定）”中决定）</w:t>
-            </w:r>
-          </w:p>
-        </w:tc>
-        <w:tc>
-          <w:tcPr>
-            <w:tcW w:type="dxa" w:w="4540"/>
-            <w:tcBorders>
-              <w:top w:val="single" w:color="A6B8D0" w:sz="4"/>
-              <w:left w:val="single" w:color="A6B8D0" w:sz="4"/>
-              <w:bottom w:val="single" w:color="A6B8D0" w:sz="4"/>
-              <w:right w:val="single" w:color="A6B8D0" w:sz="4"/>
-            </w:tcBorders>
-            <w:tcMar>
-              <w:top w:type="dxa" w:w="50"/>
-              <w:left w:type="dxa" w:w="90"/>
-              <w:bottom w:type="dxa" w:w="50"/>
-              <w:right w:type="dxa" w:w="90"/>
-            </w:tcMar>
-          </w:tcPr>
-          <w:p>
-            <w:pPr>
-              <w:keepNext/>
-              <w:keepLines/>
-              <w:spacing w:after="0" w:before="0" w:line="280"/>
-            </w:pPr>
-            <w:r>
-              <w:rPr>
-                <w:rFonts w:ascii="Microsoft YaHei" w:eastAsia="Microsoft YaHei" w:hAnsi="Microsoft YaHei"/>
-                <w:b w:val="false"/>
-                <w:bCs w:val="false"/>
-                <w:sz w:val="18"/>
-                <w:szCs w:val="18"/>
-              </w:rPr>
-              <w:t xml:space="preserve">许可范围的选项</w:t>
-            </w:r>
-          </w:p>
-        </w:tc>
-      </w:tr>
-      <w:tr>
-        <w:trPr>
-          <w:cantSplit/>
-          <w:tblHeader w:val="off"/>
-        </w:trPr>
-        <w:tc>
-          <w:tcPr>
-            <w:tcW w:type="dxa" w:w="891"/>
-            <w:tcBorders>
-              <w:top w:val="single" w:color="A6B8D0" w:sz="4"/>
-              <w:left w:val="single" w:color="A6B8D0" w:sz="4"/>
-              <w:bottom w:val="single" w:color="A6B8D0" w:sz="4"/>
-              <w:right w:val="single" w:color="A6B8D0" w:sz="4"/>
-            </w:tcBorders>
-            <w:tcMar>
-              <w:top w:type="dxa" w:w="50"/>
-              <w:left w:type="dxa" w:w="90"/>
-              <w:bottom w:type="dxa" w:w="50"/>
-              <w:right w:type="dxa" w:w="90"/>
-            </w:tcMar>
-          </w:tcPr>
-          <w:p>
-            <w:pPr>
-              <w:keepNext/>
-              <w:keepLines/>
-              <w:spacing w:after="0" w:before="0" w:line="280"/>
-            </w:pPr>
-            <w:r>
-              <w:rPr>
-                <w:rFonts w:ascii="Microsoft YaHei" w:eastAsia="Microsoft YaHei" w:hAnsi="Microsoft YaHei"/>
-                <w:b w:val="false"/>
-                <w:bCs w:val="false"/>
-                <w:sz w:val="18"/>
-                <w:szCs w:val="18"/>
-              </w:rPr>
-              <w:t xml:space="preserve">A-2</w:t>
-            </w:r>
-          </w:p>
-        </w:tc>
-        <w:tc>
-          <w:tcPr>
-            <w:tcW w:type="dxa" w:w="4207"/>
-            <w:tcBorders>
-              <w:top w:val="single" w:color="A6B8D0" w:sz="4"/>
-              <w:left w:val="single" w:color="A6B8D0" w:sz="4"/>
-              <w:bottom w:val="single" w:color="A6B8D0" w:sz="4"/>
-              <w:right w:val="single" w:color="A6B8D0" w:sz="4"/>
-            </w:tcBorders>
-            <w:tcMar>
-              <w:top w:type="dxa" w:w="50"/>
-              <w:left w:type="dxa" w:w="90"/>
-              <w:bottom w:type="dxa" w:w="50"/>
-              <w:right w:type="dxa" w:w="90"/>
-            </w:tcMar>
-          </w:tcPr>
-          <w:p>
-            <w:pPr>
-              <w:keepNext/>
+            <w:tcW w:type="dxa" w:w="908"/>
+            <w:tcBorders>
+              <w:top w:val="single" w:color="A6B8D0" w:sz="4"/>
+              <w:left w:val="single" w:color="A6B8D0" w:sz="4"/>
+              <w:bottom w:val="single" w:color="A6B8D0" w:sz="4"/>
+              <w:right w:val="single" w:color="A6B8D0" w:sz="4"/>
+            </w:tcBorders>
+            <w:tcMar>
+              <w:top w:type="dxa" w:w="50"/>
+              <w:left w:type="dxa" w:w="90"/>
+              <w:bottom w:type="dxa" w:w="50"/>
+              <w:right w:type="dxa" w:w="90"/>
+            </w:tcMar>
+          </w:tcPr>
+          <w:p>
+            <w:pPr>
+              <w:keepNext w:val="false"/>
+              <w:keepLines/>
+              <w:spacing w:after="0" w:before="0" w:line="280"/>
+            </w:pPr>
+            <w:r>
+              <w:rPr>
+                <w:rFonts w:ascii="Microsoft YaHei" w:eastAsia="Microsoft YaHei" w:hAnsi="Microsoft YaHei"/>
+                <w:b w:val="false"/>
+                <w:bCs w:val="false"/>
+                <w:sz w:val="18"/>
+                <w:szCs w:val="18"/>
+              </w:rPr>
+              <w:t xml:space="preserve">A-19</w:t>
+            </w:r>
+          </w:p>
+        </w:tc>
+        <w:tc>
+          <w:tcPr>
+            <w:tcW w:type="dxa" w:w="2686"/>
+            <w:tcBorders>
+              <w:top w:val="single" w:color="A6B8D0" w:sz="4"/>
+              <w:left w:val="single" w:color="A6B8D0" w:sz="4"/>
+              <w:bottom w:val="single" w:color="A6B8D0" w:sz="4"/>
+              <w:right w:val="single" w:color="A6B8D0" w:sz="4"/>
+            </w:tcBorders>
+            <w:tcMar>
+              <w:top w:type="dxa" w:w="50"/>
+              <w:left w:type="dxa" w:w="90"/>
+              <w:bottom w:type="dxa" w:w="50"/>
+              <w:right w:type="dxa" w:w="90"/>
+            </w:tcMar>
+          </w:tcPr>
+          <w:p>
+            <w:pPr>
+              <w:keepNext w:val="false"/>
               <w:keepLines/>
               <w:spacing w:after="0" w:before="0" w:line="280"/>
             </w:pPr>
@@ -1676,115 +596,7 @@
         </w:tc>
         <w:tc>
           <w:tcPr>
-            <w:tcW w:type="dxa" w:w="4540"/>
-            <w:tcBorders>
-              <w:top w:val="single" w:color="A6B8D0" w:sz="4"/>
-              <w:left w:val="single" w:color="A6B8D0" w:sz="4"/>
-              <w:bottom w:val="single" w:color="A6B8D0" w:sz="4"/>
-              <w:right w:val="single" w:color="A6B8D0" w:sz="4"/>
-            </w:tcBorders>
-            <w:tcMar>
-              <w:top w:type="dxa" w:w="50"/>
-              <w:left w:type="dxa" w:w="90"/>
-              <w:bottom w:type="dxa" w:w="50"/>
-              <w:right w:type="dxa" w:w="90"/>
-            </w:tcMar>
-          </w:tcPr>
-          <w:p>
-            <w:pPr>
-              <w:keepNext/>
-              <w:keepLines/>
-              <w:spacing w:after="0" w:before="0" w:line="280"/>
-            </w:pPr>
-            <w:r>
-              <w:rPr>
-                <w:rFonts w:ascii="Microsoft YaHei" w:eastAsia="Microsoft YaHei" w:hAnsi="Microsoft YaHei"/>
-                <w:b w:val="false"/>
-                <w:bCs w:val="false"/>
-                <w:sz w:val="18"/>
-                <w:szCs w:val="18"/>
-              </w:rPr>
-              <w:t xml:space="preserve">支持声明的功能（声明是效力的前提，权利性的比对也依靠它）</w:t>
-            </w:r>
-          </w:p>
-        </w:tc>
-      </w:tr>
-      <w:tr>
-        <w:trPr>
-          <w:cantSplit/>
-          <w:tblHeader w:val="off"/>
-        </w:trPr>
-        <w:tc>
-          <w:tcPr>
-            <w:tcW w:type="dxa" w:w="891"/>
-            <w:tcBorders>
-              <w:top w:val="single" w:color="A6B8D0" w:sz="4"/>
-              <w:left w:val="single" w:color="A6B8D0" w:sz="4"/>
-              <w:bottom w:val="single" w:color="A6B8D0" w:sz="4"/>
-              <w:right w:val="single" w:color="A6B8D0" w:sz="4"/>
-            </w:tcBorders>
-            <w:tcMar>
-              <w:top w:type="dxa" w:w="50"/>
-              <w:left w:type="dxa" w:w="90"/>
-              <w:bottom w:type="dxa" w:w="50"/>
-              <w:right w:type="dxa" w:w="90"/>
-            </w:tcMar>
-          </w:tcPr>
-          <w:p>
-            <w:pPr>
-              <w:keepNext w:val="false"/>
-              <w:keepLines/>
-              <w:spacing w:after="0" w:before="0" w:line="280"/>
-            </w:pPr>
-            <w:r>
-              <w:rPr>
-                <w:rFonts w:ascii="Microsoft YaHei" w:eastAsia="Microsoft YaHei" w:hAnsi="Microsoft YaHei"/>
-                <w:b w:val="false"/>
-                <w:bCs w:val="false"/>
-                <w:sz w:val="18"/>
-                <w:szCs w:val="18"/>
-              </w:rPr>
-              <w:t xml:space="preserve">A-19</w:t>
-            </w:r>
-          </w:p>
-        </w:tc>
-        <w:tc>
-          <w:tcPr>
-            <w:tcW w:type="dxa" w:w="4207"/>
-            <w:tcBorders>
-              <w:top w:val="single" w:color="A6B8D0" w:sz="4"/>
-              <w:left w:val="single" w:color="A6B8D0" w:sz="4"/>
-              <w:bottom w:val="single" w:color="A6B8D0" w:sz="4"/>
-              <w:right w:val="single" w:color="A6B8D0" w:sz="4"/>
-            </w:tcBorders>
-            <w:tcMar>
-              <w:top w:type="dxa" w:w="50"/>
-              <w:left w:type="dxa" w:w="90"/>
-              <w:bottom w:type="dxa" w:w="50"/>
-              <w:right w:type="dxa" w:w="90"/>
-            </w:tcMar>
-          </w:tcPr>
-          <w:p>
-            <w:pPr>
-              <w:keepNext w:val="false"/>
-              <w:keepLines/>
-              <w:spacing w:after="0" w:before="0" w:line="280"/>
-            </w:pPr>
-            <w:r>
-              <w:rPr>
-                <w:rFonts w:ascii="Microsoft YaHei" w:eastAsia="Microsoft YaHei" w:hAnsi="Microsoft YaHei"/>
-                <w:b w:val="false"/>
-                <w:bCs w:val="false"/>
-                <w:sz w:val="18"/>
-                <w:szCs w:val="18"/>
-              </w:rPr>
-              <w:t xml:space="preserve">项目划分中发现的遗漏</w:t>
-            </w:r>
-          </w:p>
-        </w:tc>
-        <w:tc>
-          <w:tcPr>
-            <w:tcW w:type="dxa" w:w="4540"/>
+            <w:tcW w:type="dxa" w:w="6044"/>
             <w:tcBorders>
               <w:top w:val="single" w:color="A6B8D0" w:sz="4"/>
               <w:left w:val="single" w:color="A6B8D0" w:sz="4"/>
@@ -2977,7 +1789,7 @@
                 <w:sz w:val="18"/>
                 <w:szCs w:val="18"/>
               </w:rPr>
-              <w:t xml:space="preserve">能检测随附文件的改写（R-5-2-2“能知道是否被改写”）。把图片与文件作为一组联系起来</w:t>
+              <w:t xml:space="preserve">能检测随附文件的改写（R-5-2-2）。把图片与文件作为一组联系起来</w:t>
             </w:r>
           </w:p>
         </w:tc>
@@ -3119,7 +1931,7 @@
                 <w:sz w:val="18"/>
                 <w:szCs w:val="18"/>
               </w:rPr>
-              <w:t xml:space="preserve">能把文字的更新送达使用者，并能在事后显示以哪个版本制作（R-5-3-1“能知道谁写的、谁确认的、是哪个版本”、R-5-3-2“能把更新送到使用者（参考信息的分发。1-3）”）</w:t>
+              <w:t xml:space="preserve">能把文字的更新送达使用者，并能在事后显示以哪个版本制作（R-5-3-1、R-5-3-2）</w:t>
             </w:r>
           </w:p>
         </w:tc>
@@ -4412,6 +3224,24 @@
     <w:p>
       <w:pPr>
         <w:pStyle w:val="ListParagraph"/>
+        <w:keepNext/>
+        <w:keepLines/>
+        <w:numPr>
+          <w:ilvl w:val="0"/>
+          <w:numId w:val="2"/>
+        </w:numPr>
+        <w:spacing w:after="20" w:before="20" w:line="300"/>
+      </w:pPr>
+      <w:r>
+        <w:rPr>
+          <w:rFonts w:ascii="Microsoft YaHei" w:eastAsia="Microsoft YaHei" w:hAnsi="Microsoft YaHei"/>
+        </w:rPr>
+        <w:t xml:space="preserve">社交平台用图片默认的许可范围为“相当于P1：仅限浏览，禁止转载”（第3章 8.2“系统的差异”）。</w:t>
+      </w:r>
+    </w:p>
+    <w:p>
+      <w:pPr>
+        <w:pStyle w:val="ListParagraph"/>
         <w:keepNext w:val="false"/>
         <w:keepLines/>
         <w:numPr>
@@ -4424,7 +3254,55 @@
         <w:rPr>
           <w:rFonts w:ascii="Microsoft YaHei" w:eastAsia="Microsoft YaHei" w:hAnsi="Microsoft YaHei"/>
         </w:rPr>
-        <w:t xml:space="preserve">社交平台用图片默认的许可范围为“相当于P1：仅限浏览，禁止转载”（第3章 8.2“系统的差异”）。</w:t>
+        <w:t xml:space="preserve">简短标记（可见签名的插入字段</w:t>
+      </w:r>
+      <w:r>
+        <w:rPr>
+          <w:rFonts w:ascii="Consolas" w:eastAsia="Microsoft YaHei" w:hAnsi="Consolas"/>
+        </w:rPr>
+        <w:t xml:space="preserve">{license}</w:t>
+      </w:r>
+      <w:r>
+        <w:rPr>
+          <w:rFonts w:ascii="Microsoft YaHei" w:eastAsia="Microsoft YaHei" w:hAnsi="Microsoft YaHei"/>
+        </w:rPr>
+        <w:t xml:space="preserve">。第4章 3.1“内容与插入字段”）：把基本范围与追加许可的ID以</w:t>
+      </w:r>
+      <w:r>
+        <w:rPr>
+          <w:rFonts w:ascii="Consolas" w:eastAsia="Microsoft YaHei" w:hAnsi="Consolas"/>
+        </w:rPr>
+        <w:t xml:space="preserve">+</w:t>
+      </w:r>
+      <w:r>
+        <w:rPr>
+          <w:rFonts w:ascii="Microsoft YaHei" w:eastAsia="Microsoft YaHei" w:hAnsi="Microsoft YaHei"/>
+        </w:rPr>
+        <w:t xml:space="preserve">连接（例：</w:t>
+      </w:r>
+      <w:r>
+        <w:rPr>
+          <w:rFonts w:ascii="Consolas" w:eastAsia="Microsoft YaHei" w:hAnsi="Consolas"/>
+        </w:rPr>
+        <w:t xml:space="preserve">P1</w:t>
+      </w:r>
+      <w:r>
+        <w:rPr>
+          <w:rFonts w:ascii="Microsoft YaHei" w:eastAsia="Microsoft YaHei" w:hAnsi="Microsoft YaHei"/>
+        </w:rPr>
+        <w:t xml:space="preserve">、</w:t>
+      </w:r>
+      <w:r>
+        <w:rPr>
+          <w:rFonts w:ascii="Consolas" w:eastAsia="Microsoft YaHei" w:hAnsi="Consolas"/>
+        </w:rPr>
+        <w:t xml:space="preserve">P2+A1+A2</w:t>
+      </w:r>
+      <w:r>
+        <w:rPr>
+          <w:rFonts w:ascii="Microsoft YaHei" w:eastAsia="Microsoft YaHei" w:hAnsi="Microsoft YaHei"/>
+        </w:rPr>
+        <w:t xml:space="preserve">。与Creative Commons的缩写（CC BY-NC）相同的思路）。</w:t>
       </w:r>
     </w:p>
     <w:p>
@@ -4506,6 +3384,24 @@
     <w:p>
       <w:pPr>
         <w:pStyle w:val="ListParagraph"/>
+        <w:keepNext/>
+        <w:keepLines/>
+        <w:numPr>
+          <w:ilvl w:val="0"/>
+          <w:numId w:val="2"/>
+        </w:numPr>
+        <w:spacing w:after="20" w:before="20" w:line="300"/>
+      </w:pPr>
+      <w:r>
+        <w:rPr>
+          <w:rFonts w:ascii="Microsoft YaHei" w:eastAsia="Microsoft YaHei" w:hAnsi="Microsoft YaHei"/>
+        </w:rPr>
+        <w:t xml:space="preserve">登记（第6章“登记与证据保全”）时，以从转载图片的隐形水印读出的识别编号查找作品数据，与所选的许可范围对照，显示“违反了什么”（D-9-2“以销售时选择的许可范围，作为判断转载抵触了什么的基准”）。</w:t>
+      </w:r>
+    </w:p>
+    <w:p>
+      <w:pPr>
+        <w:pStyle w:val="ListParagraph"/>
         <w:keepNext w:val="false"/>
         <w:keepLines/>
         <w:numPr>
@@ -4518,7 +3414,7 @@
         <w:rPr>
           <w:rFonts w:ascii="Microsoft YaHei" w:eastAsia="Microsoft YaHei" w:hAnsi="Microsoft YaHei"/>
         </w:rPr>
-        <w:t xml:space="preserve">登记（第6章“登记与证据保全”）时，以从转载图片的隐形水印读出的识别编号查找作品数据，与所选的许可范围对照，显示“违反了什么”（D-9-2“以销售时选择的许可范围，作为判断转载抵触了什么的基准”）。</w:t>
+        <w:t xml:space="preserve">候选的规则（第6章 4.2“违反了什么”所显示的候选）：根据转载的形态（有偿的分发、已公开。第6章 2.3）与许可范围，显示“许可范围外的公开（转载）”“商业利用（无另行许可）”。“比对数据的删除”只在保留C2PA的途径（第3章 10.3“在发布网站、云端的保留”中确认会保留的发布网站、云端）上没有C2PA签名时，或转载图片是从交付用输出中仅去掉C2PA签名者（不伴随格式转换、再压缩，像素相同）时显示。多数社交平台在发布时会去掉C2PA，因此社交平台上没有C2PA签名不构成删除的线索（日本法也把技术限制导致的删除除外。法务调查 L-1“权利管理信息的去除、改变（日）”）。</w:t>
       </w:r>
     </w:p>
     <w:p>
@@ -4571,6 +3467,24 @@
     <w:p>
       <w:pPr>
         <w:pStyle w:val="ListParagraph"/>
+        <w:keepNext/>
+        <w:keepLines/>
+        <w:numPr>
+          <w:ilvl w:val="0"/>
+          <w:numId w:val="2"/>
+        </w:numPr>
+        <w:spacing w:after="20" w:before="20" w:line="300"/>
+      </w:pPr>
+      <w:r>
+        <w:rPr>
+          <w:rFonts w:ascii="Microsoft YaHei" w:eastAsia="Microsoft YaHei" w:hAnsi="Microsoft YaHei"/>
+        </w:rPr>
+        <w:t xml:space="preserve">不缩小范围（因为这会单方面撤销购买者已经获得的许可）。</w:t>
+      </w:r>
+    </w:p>
+    <w:p>
+      <w:pPr>
+        <w:pStyle w:val="ListParagraph"/>
         <w:keepNext w:val="false"/>
         <w:keepLines/>
         <w:numPr>
@@ -4583,7 +3497,31 @@
         <w:rPr>
           <w:rFonts w:ascii="Microsoft YaHei" w:eastAsia="Microsoft YaHei" w:hAnsi="Microsoft YaHei"/>
         </w:rPr>
-        <w:t xml:space="preserve">不缩小范围（因为这会单方面撤销购买者已经获得的许可）。</w:t>
+        <w:t xml:space="preserve">参考信息发布带“订正”标记（错误的窗口、文字的订正。第8章 3.4目录的</w:t>
+      </w:r>
+      <w:r>
+        <w:rPr>
+          <w:rFonts w:ascii="Consolas" w:eastAsia="Microsoft YaHei" w:hAnsi="Consolas"/>
+        </w:rPr>
+        <w:t xml:space="preserve">corrections</w:t>
+      </w:r>
+      <w:r>
+        <w:rPr>
+          <w:rFonts w:ascii="Microsoft YaHei" w:eastAsia="Microsoft YaHei" w:hAnsi="Microsoft YaHei"/>
+        </w:rPr>
+        <w:t xml:space="preserve">：订正的文件、含错误的最初版本、理由）的版本时，应用自动列出受影响的过去作品（以含错误的版本到订正前的版本导出、使用了该文字文件者），并在输出文件夹生成订正版随附文件（</w:t>
+      </w:r>
+      <w:r>
+        <w:rPr>
+          <w:rFonts w:ascii="Consolas" w:eastAsia="Microsoft YaHei" w:hAnsi="Consolas"/>
+        </w:rPr>
+        <w:t xml:space="preserve">00_RIGHTS_ERRATA.txt</w:t>
+      </w:r>
+      <w:r>
+        <w:rPr>
+          <w:rFonts w:ascii="Microsoft YaHei" w:eastAsia="Microsoft YaHei" w:hAnsi="Microsoft YaHei"/>
+        </w:rPr>
+        <w:t xml:space="preserve">。原文件与订正的差异、原哈希与订正版的哈希）。使用者只需重新放到给购买者的位置。许可范围不变（2026-09-30 NRSD的要求）。输出文件夹不存在时让使用者选择位置（默认为原位置的上级），并将新位置追记到作品数据的输出位置（第3章 7.2）。</w:t>
       </w:r>
     </w:p>
     <w:p>
@@ -5087,6 +4025,36 @@
     <w:p>
       <w:pPr>
         <w:pStyle w:val="ListParagraph"/>
+        <w:keepNext/>
+        <w:keepLines/>
+        <w:numPr>
+          <w:ilvl w:val="0"/>
+          <w:numId w:val="2"/>
+        </w:numPr>
+        <w:spacing w:after="20" w:before="20" w:line="300"/>
+      </w:pPr>
+      <w:r>
+        <w:rPr>
+          <w:rFonts w:ascii="Microsoft YaHei" w:eastAsia="Microsoft YaHei" w:hAnsi="Microsoft YaHei"/>
+        </w:rPr>
+        <w:t xml:space="preserve">放在文件夹的最上层，名称以</w:t>
+      </w:r>
+      <w:r>
+        <w:rPr>
+          <w:rFonts w:ascii="Consolas" w:eastAsia="Microsoft YaHei" w:hAnsi="Consolas"/>
+        </w:rPr>
+        <w:t xml:space="preserve">00_</w:t>
+      </w:r>
+      <w:r>
+        <w:rPr>
+          <w:rFonts w:ascii="Microsoft YaHei" w:eastAsia="Microsoft YaHei" w:hAnsi="Microsoft YaHei"/>
+        </w:rPr>
+        <w:t xml:space="preserve">开头，使其排在图片之前。</w:t>
+      </w:r>
+    </w:p>
+    <w:p>
+      <w:pPr>
+        <w:pStyle w:val="ListParagraph"/>
         <w:keepNext w:val="false"/>
         <w:keepLines/>
         <w:numPr>
@@ -5099,19 +4067,31 @@
         <w:rPr>
           <w:rFonts w:ascii="Microsoft YaHei" w:eastAsia="Microsoft YaHei" w:hAnsi="Microsoft YaHei"/>
         </w:rPr>
-        <w:t xml:space="preserve">放在文件夹的最上层，名称以</w:t>
+        <w:t xml:space="preserve">3个文件起到与Creative Commons许可的3层（法律文本、人可读的Deed、机器可读的ccREL）相同的作用：国别部分为法律文本，</w:t>
       </w:r>
       <w:r>
         <w:rPr>
           <w:rFonts w:ascii="Consolas" w:eastAsia="Microsoft YaHei" w:hAnsi="Consolas"/>
         </w:rPr>
-        <w:t xml:space="preserve">00_</w:t>
-      </w:r>
-      <w:r>
-        <w:rPr>
-          <w:rFonts w:ascii="Microsoft YaHei" w:eastAsia="Microsoft YaHei" w:hAnsi="Microsoft YaHei"/>
-        </w:rPr>
-        <w:t xml:space="preserve">开头，使其排在图片之前。</w:t>
+        <w:t xml:space="preserve">00_RIGHTS_README.txt</w:t>
+      </w:r>
+      <w:r>
+        <w:rPr>
+          <w:rFonts w:ascii="Microsoft YaHei" w:eastAsia="Microsoft YaHei" w:hAnsi="Microsoft YaHei"/>
+        </w:rPr>
+        <w:t xml:space="preserve">为人可读的摘要，</w:t>
+      </w:r>
+      <w:r>
+        <w:rPr>
+          <w:rFonts w:ascii="Consolas" w:eastAsia="Microsoft YaHei" w:hAnsi="Consolas"/>
+        </w:rPr>
+        <w:t xml:space="preserve">00_RIGHTS.json</w:t>
+      </w:r>
+      <w:r>
+        <w:rPr>
+          <w:rFonts w:ascii="Microsoft YaHei" w:eastAsia="Microsoft YaHei" w:hAnsi="Microsoft YaHei"/>
+        </w:rPr>
+        <w:t xml:space="preserve">（ODRL）为机器可读的形式。公开页面的“核验”页把ODRL以与CC的Deed相同的形式（可以、条件、不可以的3列与标记）展开为人的语言显示（第8章 3.3）（2026-10-01 NRSD的要求）。</w:t>
       </w:r>
     </w:p>
     <w:p>
@@ -7244,6 +6224,42 @@
     <w:p>
       <w:pPr>
         <w:pStyle w:val="ListParagraph"/>
+        <w:keepNext/>
+        <w:keepLines/>
+        <w:numPr>
+          <w:ilvl w:val="0"/>
+          <w:numId w:val="2"/>
+        </w:numPr>
+        <w:spacing w:after="20" w:before="20" w:line="300"/>
+      </w:pPr>
+      <w:r>
+        <w:rPr>
+          <w:rFonts w:ascii="Microsoft YaHei" w:eastAsia="Microsoft YaHei" w:hAnsi="Microsoft YaHei"/>
+        </w:rPr>
+        <w:t xml:space="preserve">DD-5-4“随附文件的SHA-256记录在清单中”。把图片与随附文件的文件夹放入应用的“核验”界面（第10章 G-13“核验”）后（只放入文件夹时使用其中的图片，一张图片都没有时显示“没有图片”），把各文件的SHA-256与清单的一览比较，显示一致、不一致、一览中没有的文件、缺少的文件。图片本身的核验依据第3章 10.2“使用者的确认”。</w:t>
+      </w:r>
+    </w:p>
+    <w:p>
+      <w:pPr>
+        <w:pStyle w:val="ListParagraph"/>
+        <w:keepNext/>
+        <w:keepLines/>
+        <w:numPr>
+          <w:ilvl w:val="0"/>
+          <w:numId w:val="2"/>
+        </w:numPr>
+        <w:spacing w:after="20" w:before="20" w:line="300"/>
+      </w:pPr>
+      <w:r>
+        <w:rPr>
+          <w:rFonts w:ascii="Microsoft YaHei" w:eastAsia="Microsoft YaHei" w:hAnsi="Microsoft YaHei"/>
+        </w:rPr>
+        <w:t xml:space="preserve">在公开页面的“核验”页（第8章 3.3）上，拖入图片与随附文件的文件夹也能进行同样的比对（一致、不一致、没有、多余）。只在浏览器中运行，不发送到任何地方。购买者、专家无需应用即可核验（2026-10-01 NRSD的要求）。</w:t>
+      </w:r>
+    </w:p>
+    <w:p>
+      <w:pPr>
+        <w:pStyle w:val="ListParagraph"/>
         <w:keepNext w:val="false"/>
         <w:keepLines/>
         <w:numPr>
@@ -7256,7 +6272,67 @@
         <w:rPr>
           <w:rFonts w:ascii="Microsoft YaHei" w:eastAsia="Microsoft YaHei" w:hAnsi="Microsoft YaHei"/>
         </w:rPr>
-        <w:t xml:space="preserve">DD-5-4“随附文件的SHA-256记录在清单中”。把图片与随附文件的文件夹放入应用的“核验”界面（第10章 G-13“核验”）后，把各文件的SHA-256与清单的一览比较，显示一致、不一致、一览中没有的文件、缺少的文件。图片本身的核验依据第3章 10.2“使用者的确认”。</w:t>
+        <w:t xml:space="preserve">订正版（2.4）的辨别：在</w:t>
+      </w:r>
+      <w:r>
+        <w:rPr>
+          <w:rFonts w:ascii="Consolas" w:eastAsia="Microsoft YaHei" w:hAnsi="Consolas"/>
+        </w:rPr>
+        <w:t xml:space="preserve">00_RIGHTS_ERRATA.txt</w:t>
+      </w:r>
+      <w:r>
+        <w:rPr>
+          <w:rFonts w:ascii="Microsoft YaHei" w:eastAsia="Microsoft YaHei" w:hAnsi="Microsoft YaHei"/>
+        </w:rPr>
+        <w:t xml:space="preserve">的开头写入订正对象的各原文件的SHA-256与订正版的SHA-256，并把记录电子签名（JWS detached、</w:t>
+      </w:r>
+      <w:r>
+        <w:rPr>
+          <w:rFonts w:ascii="Consolas" w:eastAsia="Microsoft YaHei" w:hAnsi="Consolas"/>
+        </w:rPr>
+        <w:t xml:space="preserve">x5c</w:t>
+      </w:r>
+      <w:r>
+        <w:rPr>
+          <w:rFonts w:ascii="Microsoft YaHei" w:eastAsia="Microsoft YaHei" w:hAnsi="Microsoft YaHei"/>
+        </w:rPr>
+        <w:t xml:space="preserve">。第1章 8.3）附为</w:t>
+      </w:r>
+      <w:r>
+        <w:rPr>
+          <w:rFonts w:ascii="Consolas" w:eastAsia="Microsoft YaHei" w:hAnsi="Consolas"/>
+        </w:rPr>
+        <w:t xml:space="preserve">00_RIGHTS_ERRATA.txt.sig</w:t>
+      </w:r>
+      <w:r>
+        <w:rPr>
+          <w:rFonts w:ascii="Microsoft YaHei" w:eastAsia="Microsoft YaHei" w:hAnsi="Microsoft YaHei"/>
+        </w:rPr>
+        <w:t xml:space="preserve">。G-13与公开页面的核验，对清单一览中没有的</w:t>
+      </w:r>
+      <w:r>
+        <w:rPr>
+          <w:rFonts w:ascii="Consolas" w:eastAsia="Microsoft YaHei" w:hAnsi="Consolas"/>
+        </w:rPr>
+        <w:t xml:space="preserve">00_RIGHTS_ERRATA*</w:t>
+      </w:r>
+      <w:r>
+        <w:rPr>
+          <w:rFonts w:ascii="Microsoft YaHei" w:eastAsia="Microsoft YaHei" w:hAnsi="Microsoft YaHei"/>
+        </w:rPr>
+        <w:t xml:space="preserve">，若签名链的个人根证书与图片</w:t>
+      </w:r>
+      <w:r>
+        <w:rPr>
+          <w:rFonts w:ascii="Consolas" w:eastAsia="Microsoft YaHei" w:hAnsi="Consolas"/>
+        </w:rPr>
+        <w:t xml:space="preserve">x5chain</w:t>
+      </w:r>
+      <w:r>
+        <w:rPr>
+          <w:rFonts w:ascii="Microsoft YaHei" w:eastAsia="Microsoft YaHei" w:hAnsi="Microsoft YaHei"/>
+        </w:rPr>
+        <w:t xml:space="preserve">的根证书一致且所写的原哈希与一览相符，则显示“正当的订正版”（以发行者事后的签名文补充。与CRL同一思路）。</w:t>
       </w:r>
     </w:p>
     <w:p>
@@ -8134,7 +7210,79 @@
         <w:rPr>
           <w:rFonts w:ascii="Microsoft YaHei" w:eastAsia="Microsoft YaHei" w:hAnsi="Microsoft YaHei"/>
         </w:rPr>
-        <w:t xml:space="preserve">本系统扩展操作的名称空间为NRSD域名的URI，在公开页面上刊载操作的定义。</w:t>
+        <w:t xml:space="preserve">本系统扩展操作的名称空间为</w:t>
+      </w:r>
+      <w:r>
+        <w:rPr>
+          <w:rFonts w:ascii="Consolas" w:eastAsia="Microsoft YaHei" w:hAnsi="Consolas"/>
+        </w:rPr>
+        <w:t xml:space="preserve">https://c2pa4cosplayer.nrsd.jp/ns/odrl/</w:t>
+      </w:r>
+      <w:r>
+        <w:rPr>
+          <w:rFonts w:ascii="Microsoft YaHei" w:eastAsia="Microsoft YaHei" w:hAnsi="Microsoft YaHei"/>
+        </w:rPr>
+        <w:t xml:space="preserve">（前缀</w:t>
+      </w:r>
+      <w:r>
+        <w:rPr>
+          <w:rFonts w:ascii="Consolas" w:eastAsia="Microsoft YaHei" w:hAnsi="Consolas"/>
+        </w:rPr>
+        <w:t xml:space="preserve">nrsd:</w:t>
+      </w:r>
+      <w:r>
+        <w:rPr>
+          <w:rFonts w:ascii="Microsoft YaHei" w:eastAsia="Microsoft YaHei" w:hAnsi="Microsoft YaHei"/>
+        </w:rPr>
+        <w:t xml:space="preserve">），在公开页面上刊载操作的定义。标识符不用未注册的</w:t>
+      </w:r>
+      <w:r>
+        <w:rPr>
+          <w:rFonts w:ascii="Consolas" w:eastAsia="Microsoft YaHei" w:hAnsi="Consolas"/>
+        </w:rPr>
+        <w:t xml:space="preserve">urn:nrsd:</w:t>
+      </w:r>
+      <w:r>
+        <w:rPr>
+          <w:rFonts w:ascii="Microsoft YaHei" w:eastAsia="Microsoft YaHei" w:hAnsi="Microsoft YaHei"/>
+        </w:rPr>
+        <w:t xml:space="preserve">而以HTTPS的URI书写（W3C的“Cool URIs”、ODRL示例的惯例）：策略为</w:t>
+      </w:r>
+      <w:r>
+        <w:rPr>
+          <w:rFonts w:ascii="Consolas" w:eastAsia="Microsoft YaHei" w:hAnsi="Consolas"/>
+        </w:rPr>
+        <w:t xml:space="preserve">https://c2pa4cosplayer.nrsd.jp/id/policy/&lt;批量处理的编号&gt;</w:t>
+      </w:r>
+      <w:r>
+        <w:rPr>
+          <w:rFonts w:ascii="Microsoft YaHei" w:eastAsia="Microsoft YaHei" w:hAnsi="Microsoft YaHei"/>
+        </w:rPr>
+        <w:t xml:space="preserve">，权利人为</w:t>
+      </w:r>
+      <w:r>
+        <w:rPr>
+          <w:rFonts w:ascii="Consolas" w:eastAsia="Microsoft YaHei" w:hAnsi="Consolas"/>
+        </w:rPr>
+        <w:t xml:space="preserve">.../id/notice/&lt;声明码&gt;</w:t>
+      </w:r>
+      <w:r>
+        <w:rPr>
+          <w:rFonts w:ascii="Microsoft YaHei" w:eastAsia="Microsoft YaHei" w:hAnsi="Microsoft YaHei"/>
+        </w:rPr>
+        <w:t xml:space="preserve">，对象为</w:t>
+      </w:r>
+      <w:r>
+        <w:rPr>
+          <w:rFonts w:ascii="Consolas" w:eastAsia="Microsoft YaHei" w:hAnsi="Consolas"/>
+        </w:rPr>
+        <w:t xml:space="preserve">.../id/work/&lt;识别编号&gt;</w:t>
+      </w:r>
+      <w:r>
+        <w:rPr>
+          <w:rFonts w:ascii="Microsoft YaHei" w:eastAsia="Microsoft YaHei" w:hAnsi="Microsoft YaHei"/>
+        </w:rPr>
+        <w:t xml:space="preserve">。</w:t>
       </w:r>
     </w:p>
     <w:p>
@@ -8152,7 +7300,43 @@
         <w:rPr>
           <w:rFonts w:ascii="Microsoft YaHei" w:eastAsia="Microsoft YaHei" w:hAnsi="Microsoft YaHei"/>
         </w:rPr>
-        <w:t xml:space="preserve">对象（Asset）为识别编号的一览，提出者（assigner）为权利人的网名与声明码。</w:t>
+        <w:t xml:space="preserve">对象（Asset）为识别编号的一览，提出者（assigner）为签名者（权利人）的网名与声明码的1人。经授权者输出的主要权利人，以及有共同权利书面文件的输出的共同权利人，以本系统的扩展项目</w:t>
+      </w:r>
+      <w:r>
+        <w:rPr>
+          <w:rFonts w:ascii="Consolas" w:eastAsia="Microsoft YaHei" w:hAnsi="Consolas"/>
+        </w:rPr>
+        <w:t xml:space="preserve">nrsd:grantor</w:t>
+      </w:r>
+      <w:r>
+        <w:rPr>
+          <w:rFonts w:ascii="Microsoft YaHei" w:eastAsia="Microsoft YaHei" w:hAnsi="Microsoft YaHei"/>
+        </w:rPr>
+        <w:t xml:space="preserve">、</w:t>
+      </w:r>
+      <w:r>
+        <w:rPr>
+          <w:rFonts w:ascii="Consolas" w:eastAsia="Microsoft YaHei" w:hAnsi="Consolas"/>
+        </w:rPr>
+        <w:t xml:space="preserve">nrsd:coRightsHolder</w:t>
+      </w:r>
+      <w:r>
+        <w:rPr>
+          <w:rFonts w:ascii="Microsoft YaHei" w:eastAsia="Microsoft YaHei" w:hAnsi="Microsoft YaHei"/>
+        </w:rPr>
+        <w:t xml:space="preserve">（ODRL的Party。网名与声明码）表示。在</w:t>
+      </w:r>
+      <w:r>
+        <w:rPr>
+          <w:rFonts w:ascii="Consolas" w:eastAsia="Microsoft YaHei" w:hAnsi="Consolas"/>
+        </w:rPr>
+        <w:t xml:space="preserve">00_RIGHTS_README.txt</w:t>
+      </w:r>
+      <w:r>
+        <w:rPr>
+          <w:rFonts w:ascii="Microsoft YaHei" w:eastAsia="Microsoft YaHei" w:hAnsi="Microsoft YaHei"/>
+        </w:rPr>
+        <w:t xml:space="preserve">的“权利人”行（3.2的1）中也并列同样的人。</w:t>
       </w:r>
     </w:p>
     <w:p>
@@ -8238,7 +7422,7 @@
           <w:sz w:val="16"/>
           <w:szCs w:val="16"/>
         </w:rPr>
-        <w:t xml:space="preserve">  "uid": "urn:nrsd:policy:{批量处理的编号}",</w:t>
+        <w:t xml:space="preserve">  "uid": "https://c2pa4cosplayer.nrsd.jp/id/policy/{批量处理的编号}",</w:t>
       </w:r>
     </w:p>
     <w:p>
@@ -8255,7 +7439,7 @@
           <w:sz w:val="16"/>
           <w:szCs w:val="16"/>
         </w:rPr>
-        <w:t xml:space="preserve">  "assigner": {"uid": "urn:nrsd:notice:{声明码}", "name": "{网名}"},</w:t>
+        <w:t xml:space="preserve">  "assigner": {"uid": "https://c2pa4cosplayer.nrsd.jp/id/notice/{声明码}", "name": "{网名}"},</w:t>
       </w:r>
     </w:p>
     <w:p>
@@ -8272,7 +7456,7 @@
           <w:sz w:val="16"/>
           <w:szCs w:val="16"/>
         </w:rPr>
-        <w:t xml:space="preserve">  "target": ["urn:nrsd:id:{识别编号}", "..."],</w:t>
+        <w:t xml:space="preserve">  "target": ["https://c2pa4cosplayer.nrsd.jp/id/work/{识别编号}", "..."],</w:t>
       </w:r>
     </w:p>
     <w:p>
@@ -9432,7 +8616,187 @@
                 <w:sz w:val="18"/>
                 <w:szCs w:val="18"/>
               </w:rPr>
-              <w:t xml:space="preserve">持有参考信息包的版本（从1开始的整数。第8章 3.4“参考信息包”）与每段文字的版本（另外的项目）</w:t>
+              <w:t xml:space="preserve">持有参考信息包的版本（从1开始的整数。第8章 3.4“参考信息包”）与每段文字的版本。文字为</w:t>
+            </w:r>
+            <w:r>
+              <w:rPr>
+                <w:rFonts w:ascii="Consolas" w:eastAsia="Microsoft YaHei" w:hAnsi="Consolas"/>
+                <w:b w:val="false"/>
+                <w:bCs w:val="false"/>
+                <w:sz w:val="18"/>
+                <w:szCs w:val="18"/>
+              </w:rPr>
+              <w:t xml:space="preserve">texts/common.&lt;语言&gt;.md</w:t>
+            </w:r>
+            <w:r>
+              <w:rPr>
+                <w:rFonts w:ascii="Microsoft YaHei" w:eastAsia="Microsoft YaHei" w:hAnsi="Microsoft YaHei"/>
+                <w:b w:val="false"/>
+                <w:bCs w:val="false"/>
+                <w:sz w:val="18"/>
+                <w:szCs w:val="18"/>
+              </w:rPr>
+              <w:t xml:space="preserve">、</w:t>
+            </w:r>
+            <w:r>
+              <w:rPr>
+                <w:rFonts w:ascii="Consolas" w:eastAsia="Microsoft YaHei" w:hAnsi="Consolas"/>
+                <w:b w:val="false"/>
+                <w:bCs w:val="false"/>
+                <w:sz w:val="18"/>
+                <w:szCs w:val="18"/>
+              </w:rPr>
+              <w:t xml:space="preserve">texts/country.&lt;国家代码&gt;.&lt;语言&gt;.md</w:t>
+            </w:r>
+            <w:r>
+              <w:rPr>
+                <w:rFonts w:ascii="Microsoft YaHei" w:eastAsia="Microsoft YaHei" w:hAnsi="Microsoft YaHei"/>
+                <w:b w:val="false"/>
+                <w:bCs w:val="false"/>
+                <w:sz w:val="18"/>
+                <w:szCs w:val="18"/>
+              </w:rPr>
+              <w:t xml:space="preserve">，前言（YAML）持有</w:t>
+            </w:r>
+            <w:r>
+              <w:rPr>
+                <w:rFonts w:ascii="Consolas" w:eastAsia="Microsoft YaHei" w:hAnsi="Consolas"/>
+                <w:b w:val="false"/>
+                <w:bCs w:val="false"/>
+                <w:sz w:val="18"/>
+                <w:szCs w:val="18"/>
+              </w:rPr>
+              <w:t xml:space="preserve">version</w:t>
+            </w:r>
+            <w:r>
+              <w:rPr>
+                <w:rFonts w:ascii="Microsoft YaHei" w:eastAsia="Microsoft YaHei" w:hAnsi="Microsoft YaHei"/>
+                <w:b w:val="false"/>
+                <w:bCs w:val="false"/>
+                <w:sz w:val="18"/>
+                <w:szCs w:val="18"/>
+              </w:rPr>
+              <w:t xml:space="preserve">、</w:t>
+            </w:r>
+            <w:r>
+              <w:rPr>
+                <w:rFonts w:ascii="Consolas" w:eastAsia="Microsoft YaHei" w:hAnsi="Consolas"/>
+                <w:b w:val="false"/>
+                <w:bCs w:val="false"/>
+                <w:sz w:val="18"/>
+                <w:szCs w:val="18"/>
+              </w:rPr>
+              <w:t xml:space="preserve">reviewed_by</w:t>
+            </w:r>
+            <w:r>
+              <w:rPr>
+                <w:rFonts w:ascii="Microsoft YaHei" w:eastAsia="Microsoft YaHei" w:hAnsi="Microsoft YaHei"/>
+                <w:b w:val="false"/>
+                <w:bCs w:val="false"/>
+                <w:sz w:val="18"/>
+                <w:szCs w:val="18"/>
+              </w:rPr>
+              <w:t xml:space="preserve">、</w:t>
+            </w:r>
+            <w:r>
+              <w:rPr>
+                <w:rFonts w:ascii="Consolas" w:eastAsia="Microsoft YaHei" w:hAnsi="Consolas"/>
+                <w:b w:val="false"/>
+                <w:bCs w:val="false"/>
+                <w:sz w:val="18"/>
+                <w:szCs w:val="18"/>
+              </w:rPr>
+              <w:t xml:space="preserve">reviewed_at</w:t>
+            </w:r>
+            <w:r>
+              <w:rPr>
+                <w:rFonts w:ascii="Microsoft YaHei" w:eastAsia="Microsoft YaHei" w:hAnsi="Microsoft YaHei"/>
+                <w:b w:val="false"/>
+                <w:bCs w:val="false"/>
+                <w:sz w:val="18"/>
+                <w:szCs w:val="18"/>
+              </w:rPr>
+              <w:t xml:space="preserve">（专家的确认。R-5-3-1），正文的插入字段为</w:t>
+            </w:r>
+            <w:r>
+              <w:rPr>
+                <w:rFonts w:ascii="Consolas" w:eastAsia="Microsoft YaHei" w:hAnsi="Consolas"/>
+                <w:b w:val="false"/>
+                <w:bCs w:val="false"/>
+                <w:sz w:val="18"/>
+                <w:szCs w:val="18"/>
+              </w:rPr>
+              <w:t xml:space="preserve">{handle}</w:t>
+            </w:r>
+            <w:r>
+              <w:rPr>
+                <w:rFonts w:ascii="Microsoft YaHei" w:eastAsia="Microsoft YaHei" w:hAnsi="Microsoft YaHei"/>
+                <w:b w:val="false"/>
+                <w:bCs w:val="false"/>
+                <w:sz w:val="18"/>
+                <w:szCs w:val="18"/>
+              </w:rPr>
+              <w:t xml:space="preserve">、</w:t>
+            </w:r>
+            <w:r>
+              <w:rPr>
+                <w:rFonts w:ascii="Consolas" w:eastAsia="Microsoft YaHei" w:hAnsi="Consolas"/>
+                <w:b w:val="false"/>
+                <w:bCs w:val="false"/>
+                <w:sz w:val="18"/>
+                <w:szCs w:val="18"/>
+              </w:rPr>
+              <w:t xml:space="preserve">{account}</w:t>
+            </w:r>
+            <w:r>
+              <w:rPr>
+                <w:rFonts w:ascii="Microsoft YaHei" w:eastAsia="Microsoft YaHei" w:hAnsi="Microsoft YaHei"/>
+                <w:b w:val="false"/>
+                <w:bCs w:val="false"/>
+                <w:sz w:val="18"/>
+                <w:szCs w:val="18"/>
+              </w:rPr>
+              <w:t xml:space="preserve">、</w:t>
+            </w:r>
+            <w:r>
+              <w:rPr>
+                <w:rFonts w:ascii="Consolas" w:eastAsia="Microsoft YaHei" w:hAnsi="Consolas"/>
+                <w:b w:val="false"/>
+                <w:bCs w:val="false"/>
+                <w:sz w:val="18"/>
+                <w:szCs w:val="18"/>
+              </w:rPr>
+              <w:t xml:space="preserve">{scope}</w:t>
+            </w:r>
+            <w:r>
+              <w:rPr>
+                <w:rFonts w:ascii="Microsoft YaHei" w:eastAsia="Microsoft YaHei" w:hAnsi="Microsoft YaHei"/>
+                <w:b w:val="false"/>
+                <w:bCs w:val="false"/>
+                <w:sz w:val="18"/>
+                <w:szCs w:val="18"/>
+              </w:rPr>
+              <w:t xml:space="preserve">、</w:t>
+            </w:r>
+            <w:r>
+              <w:rPr>
+                <w:rFonts w:ascii="Consolas" w:eastAsia="Microsoft YaHei" w:hAnsi="Consolas"/>
+                <w:b w:val="false"/>
+                <w:bCs w:val="false"/>
+                <w:sz w:val="18"/>
+                <w:szCs w:val="18"/>
+              </w:rPr>
+              <w:t xml:space="preserve">{url}</w:t>
+            </w:r>
+            <w:r>
+              <w:rPr>
+                <w:rFonts w:ascii="Microsoft YaHei" w:eastAsia="Microsoft YaHei" w:hAnsi="Microsoft YaHei"/>
+                <w:b w:val="false"/>
+                <w:bCs w:val="false"/>
+                <w:sz w:val="18"/>
+                <w:szCs w:val="18"/>
+              </w:rPr>
+              <w:t xml:space="preserve">（与第4章 3.1的规则相同）</w:t>
             </w:r>
           </w:p>
         </w:tc>
@@ -9534,6 +8898,80 @@
           </w:tcPr>
           <w:p>
             <w:pPr>
+              <w:keepNext/>
+              <w:keepLines/>
+              <w:spacing w:after="0" w:before="0" w:line="280"/>
+            </w:pPr>
+            <w:r>
+              <w:rPr>
+                <w:rFonts w:ascii="Microsoft YaHei" w:eastAsia="Microsoft YaHei" w:hAnsi="Microsoft YaHei"/>
+                <w:b w:val="false"/>
+                <w:bCs w:val="false"/>
+                <w:sz w:val="18"/>
+                <w:szCs w:val="18"/>
+              </w:rPr>
+              <w:t xml:space="preserve">对法律修订的跟进</w:t>
+            </w:r>
+          </w:p>
+        </w:tc>
+        <w:tc>
+          <w:tcPr>
+            <w:tcW w:type="dxa" w:w="8608"/>
+            <w:tcBorders>
+              <w:top w:val="single" w:color="A6B8D0" w:sz="4"/>
+              <w:left w:val="single" w:color="A6B8D0" w:sz="4"/>
+              <w:bottom w:val="single" w:color="A6B8D0" w:sz="4"/>
+              <w:right w:val="single" w:color="A6B8D0" w:sz="4"/>
+            </w:tcBorders>
+            <w:tcMar>
+              <w:top w:type="dxa" w:w="50"/>
+              <w:left w:type="dxa" w:w="90"/>
+              <w:bottom w:type="dxa" w:w="50"/>
+              <w:right w:type="dxa" w:w="90"/>
+            </w:tcMar>
+          </w:tcPr>
+          <w:p>
+            <w:pPr>
+              <w:keepNext/>
+              <w:keepLines/>
+              <w:spacing w:after="0" w:before="0" w:line="280"/>
+            </w:pPr>
+            <w:r>
+              <w:rPr>
+                <w:rFonts w:ascii="Microsoft YaHei" w:eastAsia="Microsoft YaHei" w:hAnsi="Microsoft YaHei"/>
+                <w:b w:val="false"/>
+                <w:bCs w:val="false"/>
+                <w:sz w:val="18"/>
+                <w:szCs w:val="18"/>
+              </w:rPr>
+              <w:t xml:space="preserve">NRSD每季度确认，若有修订则提升版本（第1章 18.1“NRSD的参与点与体制”）</w:t>
+            </w:r>
+          </w:p>
+        </w:tc>
+      </w:tr>
+      <w:tr>
+        <w:trPr>
+          <w:cantSplit/>
+          <w:tblHeader w:val="off"/>
+        </w:trPr>
+        <w:tc>
+          <w:tcPr>
+            <w:tcW w:type="dxa" w:w="1030"/>
+            <w:tcBorders>
+              <w:top w:val="single" w:color="A6B8D0" w:sz="4"/>
+              <w:left w:val="single" w:color="A6B8D0" w:sz="4"/>
+              <w:bottom w:val="single" w:color="A6B8D0" w:sz="4"/>
+              <w:right w:val="single" w:color="A6B8D0" w:sz="4"/>
+            </w:tcBorders>
+            <w:tcMar>
+              <w:top w:type="dxa" w:w="50"/>
+              <w:left w:type="dxa" w:w="90"/>
+              <w:bottom w:type="dxa" w:w="50"/>
+              <w:right w:type="dxa" w:w="90"/>
+            </w:tcMar>
+          </w:tcPr>
+          <w:p>
+            <w:pPr>
               <w:keepNext w:val="false"/>
               <w:keepLines/>
               <w:spacing w:after="0" w:before="0" w:line="280"/>
@@ -9546,7 +8984,7 @@
                 <w:sz w:val="18"/>
                 <w:szCs w:val="18"/>
               </w:rPr>
-              <w:t xml:space="preserve">对法律修订的跟进</w:t>
+              <w:t xml:space="preserve">固定与再现</w:t>
             </w:r>
           </w:p>
         </w:tc>
@@ -9580,7 +9018,7 @@
                 <w:sz w:val="18"/>
                 <w:szCs w:val="18"/>
               </w:rPr>
-              <w:t xml:space="preserve">NRSD每季度确认，若有修订则提升版本（第1章 18.1“NRSD的参与点与体制”）</w:t>
+              <w:t xml:space="preserve">作业把开始时点的参考信息版本与所用文字文件本身复制固定，中途不改变版本。在作品数据与清单中记录所用各文件的SHA-256。作品数据所参照的版本不从终端删除，并包含在备份中。任何一次销售的随附文件，都能从G-12“作品”以当时的版本原样重新制作（2026-09-30 NRSD的要求）</w:t>
             </w:r>
           </w:p>
         </w:tc>
@@ -9939,7 +9377,7 @@
                 <w:sz w:val="18"/>
                 <w:szCs w:val="18"/>
               </w:rPr>
-              <w:t xml:space="preserve">“禁止转载。照片含 C2PA 签名、水印及识别编号。NRSD-XXXXX-XXXXX-XXXXX-XXXXX”</w:t>
+              <w:t xml:space="preserve">6.3“短档文字的草稿（3种语言）”的文字（含声明码在100个字符以内）</w:t>
             </w:r>
           </w:p>
         </w:tc>
@@ -10311,7 +9749,7 @@
         <w:rPr>
           <w:rFonts w:ascii="Microsoft YaHei" w:eastAsia="Microsoft YaHei" w:hAnsi="Microsoft YaHei"/>
         </w:rPr>
-        <w:t xml:space="preserve">字数：声明码为28个字符，上述文字连同声明码在内，日语62个字符，中文54个字符，英语94个字符，均在100个字符以内（在X的160个字符、Instagram的150个字符、小红书约100字之内。第2章 2.2“揭示声明码处的上限”）。</w:t>
+        <w:t xml:space="preserve">字数：声明码为28个字符，上述文字连同声明码在内，日语61个字符，中文53个字符，英语94个字符（2026-10-01重新计数），均在100个字符以内（在X的160个字符、Instagram的150个字符、小红书约100字之内。第2章 2.2“揭示声明码处的上限”）。</w:t>
       </w:r>
     </w:p>
     <w:p>
@@ -10356,9 +9794,8 @@
         </w:tblBorders>
       </w:tblPr>
       <w:tblGrid>
-        <w:gridCol w:w="1883"/>
-        <w:gridCol w:w="4984"/>
-        <w:gridCol w:w="2771"/>
+        <w:gridCol w:w="6128"/>
+        <w:gridCol w:w="3510"/>
       </w:tblGrid>
       <w:tr>
         <w:trPr>
@@ -10367,7 +9804,7 @@
         </w:trPr>
         <w:tc>
           <w:tcPr>
-            <w:tcW w:type="dxa" w:w="1883"/>
+            <w:tcW w:type="dxa" w:w="6128"/>
             <w:tcBorders>
               <w:top w:val="single" w:color="A6B8D0" w:sz="4"/>
               <w:left w:val="single" w:color="A6B8D0" w:sz="4"/>
@@ -10396,48 +9833,13 @@
                 <w:sz w:val="18"/>
                 <w:szCs w:val="18"/>
               </w:rPr>
-              <w:t xml:space="preserve">要求的编号</w:t>
-            </w:r>
-          </w:p>
-        </w:tc>
-        <w:tc>
-          <w:tcPr>
-            <w:tcW w:type="dxa" w:w="4984"/>
-            <w:tcBorders>
-              <w:top w:val="single" w:color="A6B8D0" w:sz="4"/>
-              <w:left w:val="single" w:color="A6B8D0" w:sz="4"/>
-              <w:bottom w:val="single" w:color="A6B8D0" w:sz="4"/>
-              <w:right w:val="single" w:color="A6B8D0" w:sz="4"/>
-            </w:tcBorders>
-            <w:shd w:fill="DCE6F2" w:color="auto" w:val="clear"/>
-            <w:tcMar>
-              <w:top w:type="dxa" w:w="50"/>
-              <w:left w:type="dxa" w:w="90"/>
-              <w:bottom w:type="dxa" w:w="50"/>
-              <w:right w:type="dxa" w:w="90"/>
-            </w:tcMar>
-          </w:tcPr>
-          <w:p>
-            <w:pPr>
-              <w:keepNext/>
-              <w:keepLines/>
-              <w:spacing w:after="0" w:before="0" w:line="280"/>
-            </w:pPr>
-            <w:r>
-              <w:rPr>
-                <w:rFonts w:ascii="Microsoft YaHei" w:eastAsia="Microsoft YaHei" w:hAnsi="Microsoft YaHei"/>
-                <w:b/>
-                <w:bCs/>
-                <w:sz w:val="18"/>
-                <w:szCs w:val="18"/>
-              </w:rPr>
-              <w:t xml:space="preserve">要求的内容</w:t>
-            </w:r>
-          </w:p>
-        </w:tc>
-        <w:tc>
-          <w:tcPr>
-            <w:tcW w:type="dxa" w:w="2771"/>
+              <w:t xml:space="preserve">要求的编号（文字见概要设计书）</w:t>
+            </w:r>
+          </w:p>
+        </w:tc>
+        <w:tc>
+          <w:tcPr>
+            <w:tcW w:type="dxa" w:w="3510"/>
             <w:tcBorders>
               <w:top w:val="single" w:color="A6B8D0" w:sz="4"/>
               <w:left w:val="single" w:color="A6B8D0" w:sz="4"/>
@@ -10478,7 +9880,7 @@
         </w:trPr>
         <w:tc>
           <w:tcPr>
-            <w:tcW w:type="dxa" w:w="1883"/>
+            <w:tcW w:type="dxa" w:w="6128"/>
             <w:tcBorders>
               <w:top w:val="single" w:color="A6B8D0" w:sz="4"/>
               <w:left w:val="single" w:color="A6B8D0" w:sz="4"/>
@@ -10512,41 +9914,7 @@
         </w:tc>
         <w:tc>
           <w:tcPr>
-            <w:tcW w:type="dxa" w:w="4984"/>
-            <w:tcBorders>
-              <w:top w:val="single" w:color="A6B8D0" w:sz="4"/>
-              <w:left w:val="single" w:color="A6B8D0" w:sz="4"/>
-              <w:bottom w:val="single" w:color="A6B8D0" w:sz="4"/>
-              <w:right w:val="single" w:color="A6B8D0" w:sz="4"/>
-            </w:tcBorders>
-            <w:tcMar>
-              <w:top w:type="dxa" w:w="50"/>
-              <w:left w:type="dxa" w:w="90"/>
-              <w:bottom w:type="dxa" w:w="50"/>
-              <w:right w:type="dxa" w:w="90"/>
-            </w:tcMar>
-          </w:tcPr>
-          <w:p>
-            <w:pPr>
-              <w:keepNext/>
-              <w:keepLines/>
-              <w:spacing w:after="0" w:before="0" w:line="280"/>
-            </w:pPr>
-            <w:r>
-              <w:rPr>
-                <w:rFonts w:ascii="Microsoft YaHei" w:eastAsia="Microsoft YaHei" w:hAnsi="Microsoft YaHei"/>
-                <w:b w:val="false"/>
-                <w:bCs w:val="false"/>
-                <w:sz w:val="18"/>
-                <w:szCs w:val="18"/>
-              </w:rPr>
-              <w:t xml:space="preserve">非技术人员能理解含义并选择（判定的标准在基本设计中规定）</w:t>
-            </w:r>
-          </w:p>
-        </w:tc>
-        <w:tc>
-          <w:tcPr>
-            <w:tcW w:type="dxa" w:w="2771"/>
+            <w:tcW w:type="dxa" w:w="3510"/>
             <w:tcBorders>
               <w:top w:val="single" w:color="A6B8D0" w:sz="4"/>
               <w:left w:val="single" w:color="A6B8D0" w:sz="4"/>
@@ -10586,7 +9954,7 @@
         </w:trPr>
         <w:tc>
           <w:tcPr>
-            <w:tcW w:type="dxa" w:w="1883"/>
+            <w:tcW w:type="dxa" w:w="6128"/>
             <w:tcBorders>
               <w:top w:val="single" w:color="A6B8D0" w:sz="4"/>
               <w:left w:val="single" w:color="A6B8D0" w:sz="4"/>
@@ -10620,41 +9988,7 @@
         </w:tc>
         <w:tc>
           <w:tcPr>
-            <w:tcW w:type="dxa" w:w="4984"/>
-            <w:tcBorders>
-              <w:top w:val="single" w:color="A6B8D0" w:sz="4"/>
-              <w:left w:val="single" w:color="A6B8D0" w:sz="4"/>
-              <w:bottom w:val="single" w:color="A6B8D0" w:sz="4"/>
-              <w:right w:val="single" w:color="A6B8D0" w:sz="4"/>
-            </w:tcBorders>
-            <w:tcMar>
-              <w:top w:type="dxa" w:w="50"/>
-              <w:left w:type="dxa" w:w="90"/>
-              <w:bottom w:type="dxa" w:w="50"/>
-              <w:right w:type="dxa" w:w="90"/>
-            </w:tcMar>
-          </w:tcPr>
-          <w:p>
-            <w:pPr>
-              <w:keepNext/>
-              <w:keepLines/>
-              <w:spacing w:after="0" w:before="0" w:line="280"/>
-            </w:pPr>
-            <w:r>
-              <w:rPr>
-                <w:rFonts w:ascii="Microsoft YaHei" w:eastAsia="Microsoft YaHei" w:hAnsi="Microsoft YaHei"/>
-                <w:b w:val="false"/>
-                <w:bCs w:val="false"/>
-                <w:sz w:val="18"/>
-                <w:szCs w:val="18"/>
-              </w:rPr>
-              <w:t xml:space="preserve">对哪张图片选择了哪个许可范围会留下记录</w:t>
-            </w:r>
-          </w:p>
-        </w:tc>
-        <w:tc>
-          <w:tcPr>
-            <w:tcW w:type="dxa" w:w="2771"/>
+            <w:tcW w:type="dxa" w:w="3510"/>
             <w:tcBorders>
               <w:top w:val="single" w:color="A6B8D0" w:sz="4"/>
               <w:left w:val="single" w:color="A6B8D0" w:sz="4"/>
@@ -10694,7 +10028,7 @@
         </w:trPr>
         <w:tc>
           <w:tcPr>
-            <w:tcW w:type="dxa" w:w="1883"/>
+            <w:tcW w:type="dxa" w:w="6128"/>
             <w:tcBorders>
               <w:top w:val="single" w:color="A6B8D0" w:sz="4"/>
               <w:left w:val="single" w:color="A6B8D0" w:sz="4"/>
@@ -10728,41 +10062,7 @@
         </w:tc>
         <w:tc>
           <w:tcPr>
-            <w:tcW w:type="dxa" w:w="4984"/>
-            <w:tcBorders>
-              <w:top w:val="single" w:color="A6B8D0" w:sz="4"/>
-              <w:left w:val="single" w:color="A6B8D0" w:sz="4"/>
-              <w:bottom w:val="single" w:color="A6B8D0" w:sz="4"/>
-              <w:right w:val="single" w:color="A6B8D0" w:sz="4"/>
-            </w:tcBorders>
-            <w:tcMar>
-              <w:top w:type="dxa" w:w="50"/>
-              <w:left w:type="dxa" w:w="90"/>
-              <w:bottom w:type="dxa" w:w="50"/>
-              <w:right w:type="dxa" w:w="90"/>
-            </w:tcMar>
-          </w:tcPr>
-          <w:p>
-            <w:pPr>
-              <w:keepNext/>
-              <w:keepLines/>
-              <w:spacing w:after="0" w:before="0" w:line="280"/>
-            </w:pPr>
-            <w:r>
-              <w:rPr>
-                <w:rFonts w:ascii="Microsoft YaHei" w:eastAsia="Microsoft YaHei" w:hAnsi="Microsoft YaHei"/>
-                <w:b w:val="false"/>
-                <w:bCs w:val="false"/>
-                <w:sz w:val="18"/>
-                <w:szCs w:val="18"/>
-              </w:rPr>
-              <w:t xml:space="preserve">销售后变更的处理已确定</w:t>
-            </w:r>
-          </w:p>
-        </w:tc>
-        <w:tc>
-          <w:tcPr>
-            <w:tcW w:type="dxa" w:w="2771"/>
+            <w:tcW w:type="dxa" w:w="3510"/>
             <w:tcBorders>
               <w:top w:val="single" w:color="A6B8D0" w:sz="4"/>
               <w:left w:val="single" w:color="A6B8D0" w:sz="4"/>
@@ -10802,7 +10102,7 @@
         </w:trPr>
         <w:tc>
           <w:tcPr>
-            <w:tcW w:type="dxa" w:w="1883"/>
+            <w:tcW w:type="dxa" w:w="6128"/>
             <w:tcBorders>
               <w:top w:val="single" w:color="A6B8D0" w:sz="4"/>
               <w:left w:val="single" w:color="A6B8D0" w:sz="4"/>
@@ -10836,41 +10136,7 @@
         </w:tc>
         <w:tc>
           <w:tcPr>
-            <w:tcW w:type="dxa" w:w="4984"/>
-            <w:tcBorders>
-              <w:top w:val="single" w:color="A6B8D0" w:sz="4"/>
-              <w:left w:val="single" w:color="A6B8D0" w:sz="4"/>
-              <w:bottom w:val="single" w:color="A6B8D0" w:sz="4"/>
-              <w:right w:val="single" w:color="A6B8D0" w:sz="4"/>
-            </w:tcBorders>
-            <w:tcMar>
-              <w:top w:type="dxa" w:w="50"/>
-              <w:left w:type="dxa" w:w="90"/>
-              <w:bottom w:type="dxa" w:w="50"/>
-              <w:right w:type="dxa" w:w="90"/>
-            </w:tcMar>
-          </w:tcPr>
-          <w:p>
-            <w:pPr>
-              <w:keepNext/>
-              <w:keepLines/>
-              <w:spacing w:after="0" w:before="0" w:line="280"/>
-            </w:pPr>
-            <w:r>
-              <w:rPr>
-                <w:rFonts w:ascii="Microsoft YaHei" w:eastAsia="Microsoft YaHei" w:hAnsi="Microsoft YaHei"/>
-                <w:b w:val="false"/>
-                <w:bCs w:val="false"/>
-                <w:sz w:val="18"/>
-                <w:szCs w:val="18"/>
-              </w:rPr>
-              <w:t xml:space="preserve">包含设计计划书9.2的事项</w:t>
-            </w:r>
-          </w:p>
-        </w:tc>
-        <w:tc>
-          <w:tcPr>
-            <w:tcW w:type="dxa" w:w="2771"/>
+            <w:tcW w:type="dxa" w:w="3510"/>
             <w:tcBorders>
               <w:top w:val="single" w:color="A6B8D0" w:sz="4"/>
               <w:left w:val="single" w:color="A6B8D0" w:sz="4"/>
@@ -10910,7 +10176,7 @@
         </w:trPr>
         <w:tc>
           <w:tcPr>
-            <w:tcW w:type="dxa" w:w="1883"/>
+            <w:tcW w:type="dxa" w:w="6128"/>
             <w:tcBorders>
               <w:top w:val="single" w:color="A6B8D0" w:sz="4"/>
               <w:left w:val="single" w:color="A6B8D0" w:sz="4"/>
@@ -10944,41 +10210,7 @@
         </w:tc>
         <w:tc>
           <w:tcPr>
-            <w:tcW w:type="dxa" w:w="4984"/>
-            <w:tcBorders>
-              <w:top w:val="single" w:color="A6B8D0" w:sz="4"/>
-              <w:left w:val="single" w:color="A6B8D0" w:sz="4"/>
-              <w:bottom w:val="single" w:color="A6B8D0" w:sz="4"/>
-              <w:right w:val="single" w:color="A6B8D0" w:sz="4"/>
-            </w:tcBorders>
-            <w:tcMar>
-              <w:top w:type="dxa" w:w="50"/>
-              <w:left w:type="dxa" w:w="90"/>
-              <w:bottom w:type="dxa" w:w="50"/>
-              <w:right w:type="dxa" w:w="90"/>
-            </w:tcMar>
-          </w:tcPr>
-          <w:p>
-            <w:pPr>
-              <w:keepNext/>
-              <w:keepLines/>
-              <w:spacing w:after="0" w:before="0" w:line="280"/>
-            </w:pPr>
-            <w:r>
-              <w:rPr>
-                <w:rFonts w:ascii="Microsoft YaHei" w:eastAsia="Microsoft YaHei" w:hAnsi="Microsoft YaHei"/>
-                <w:b w:val="false"/>
-                <w:bCs w:val="false"/>
-                <w:sz w:val="18"/>
-                <w:szCs w:val="18"/>
-              </w:rPr>
-              <w:t xml:space="preserve">能知道被改写</w:t>
-            </w:r>
-          </w:p>
-        </w:tc>
-        <w:tc>
-          <w:tcPr>
-            <w:tcW w:type="dxa" w:w="2771"/>
+            <w:tcW w:type="dxa" w:w="3510"/>
             <w:tcBorders>
               <w:top w:val="single" w:color="A6B8D0" w:sz="4"/>
               <w:left w:val="single" w:color="A6B8D0" w:sz="4"/>
@@ -11018,7 +10250,7 @@
         </w:trPr>
         <w:tc>
           <w:tcPr>
-            <w:tcW w:type="dxa" w:w="1883"/>
+            <w:tcW w:type="dxa" w:w="6128"/>
             <w:tcBorders>
               <w:top w:val="single" w:color="A6B8D0" w:sz="4"/>
               <w:left w:val="single" w:color="A6B8D0" w:sz="4"/>
@@ -11052,41 +10284,7 @@
         </w:tc>
         <w:tc>
           <w:tcPr>
-            <w:tcW w:type="dxa" w:w="4984"/>
-            <w:tcBorders>
-              <w:top w:val="single" w:color="A6B8D0" w:sz="4"/>
-              <w:left w:val="single" w:color="A6B8D0" w:sz="4"/>
-              <w:bottom w:val="single" w:color="A6B8D0" w:sz="4"/>
-              <w:right w:val="single" w:color="A6B8D0" w:sz="4"/>
-            </w:tcBorders>
-            <w:tcMar>
-              <w:top w:type="dxa" w:w="50"/>
-              <w:left w:type="dxa" w:w="90"/>
-              <w:bottom w:type="dxa" w:w="50"/>
-              <w:right w:type="dxa" w:w="90"/>
-            </w:tcMar>
-          </w:tcPr>
-          <w:p>
-            <w:pPr>
-              <w:keepNext/>
-              <w:keepLines/>
-              <w:spacing w:after="0" w:before="0" w:line="280"/>
-            </w:pPr>
-            <w:r>
-              <w:rPr>
-                <w:rFonts w:ascii="Microsoft YaHei" w:eastAsia="Microsoft YaHei" w:hAnsi="Microsoft YaHei"/>
-                <w:b w:val="false"/>
-                <w:bCs w:val="false"/>
-                <w:sz w:val="18"/>
-                <w:szCs w:val="18"/>
-              </w:rPr>
-              <w:t xml:space="preserve">能知道由谁书写、由谁确认、是哪个版本</w:t>
-            </w:r>
-          </w:p>
-        </w:tc>
-        <w:tc>
-          <w:tcPr>
-            <w:tcW w:type="dxa" w:w="2771"/>
+            <w:tcW w:type="dxa" w:w="3510"/>
             <w:tcBorders>
               <w:top w:val="single" w:color="A6B8D0" w:sz="4"/>
               <w:left w:val="single" w:color="A6B8D0" w:sz="4"/>
@@ -11126,7 +10324,7 @@
         </w:trPr>
         <w:tc>
           <w:tcPr>
-            <w:tcW w:type="dxa" w:w="1883"/>
+            <w:tcW w:type="dxa" w:w="6128"/>
             <w:tcBorders>
               <w:top w:val="single" w:color="A6B8D0" w:sz="4"/>
               <w:left w:val="single" w:color="A6B8D0" w:sz="4"/>
@@ -11160,41 +10358,7 @@
         </w:tc>
         <w:tc>
           <w:tcPr>
-            <w:tcW w:type="dxa" w:w="4984"/>
-            <w:tcBorders>
-              <w:top w:val="single" w:color="A6B8D0" w:sz="4"/>
-              <w:left w:val="single" w:color="A6B8D0" w:sz="4"/>
-              <w:bottom w:val="single" w:color="A6B8D0" w:sz="4"/>
-              <w:right w:val="single" w:color="A6B8D0" w:sz="4"/>
-            </w:tcBorders>
-            <w:tcMar>
-              <w:top w:type="dxa" w:w="50"/>
-              <w:left w:type="dxa" w:w="90"/>
-              <w:bottom w:type="dxa" w:w="50"/>
-              <w:right w:type="dxa" w:w="90"/>
-            </w:tcMar>
-          </w:tcPr>
-          <w:p>
-            <w:pPr>
-              <w:keepNext/>
-              <w:keepLines/>
-              <w:spacing w:after="0" w:before="0" w:line="280"/>
-            </w:pPr>
-            <w:r>
-              <w:rPr>
-                <w:rFonts w:ascii="Microsoft YaHei" w:eastAsia="Microsoft YaHei" w:hAnsi="Microsoft YaHei"/>
-                <w:b w:val="false"/>
-                <w:bCs w:val="false"/>
-                <w:sz w:val="18"/>
-                <w:szCs w:val="18"/>
-              </w:rPr>
-              <w:t xml:space="preserve">能把更新送达使用者（参考信息的分发。1-3）</w:t>
-            </w:r>
-          </w:p>
-        </w:tc>
-        <w:tc>
-          <w:tcPr>
-            <w:tcW w:type="dxa" w:w="2771"/>
+            <w:tcW w:type="dxa" w:w="3510"/>
             <w:tcBorders>
               <w:top w:val="single" w:color="A6B8D0" w:sz="4"/>
               <w:left w:val="single" w:color="A6B8D0" w:sz="4"/>
@@ -11234,7 +10398,7 @@
         </w:trPr>
         <w:tc>
           <w:tcPr>
-            <w:tcW w:type="dxa" w:w="1883"/>
+            <w:tcW w:type="dxa" w:w="6128"/>
             <w:tcBorders>
               <w:top w:val="single" w:color="A6B8D0" w:sz="4"/>
               <w:left w:val="single" w:color="A6B8D0" w:sz="4"/>
@@ -11268,41 +10432,7 @@
         </w:tc>
         <w:tc>
           <w:tcPr>
-            <w:tcW w:type="dxa" w:w="4984"/>
-            <w:tcBorders>
-              <w:top w:val="single" w:color="A6B8D0" w:sz="4"/>
-              <w:left w:val="single" w:color="A6B8D0" w:sz="4"/>
-              <w:bottom w:val="single" w:color="A6B8D0" w:sz="4"/>
-              <w:right w:val="single" w:color="A6B8D0" w:sz="4"/>
-            </w:tcBorders>
-            <w:tcMar>
-              <w:top w:type="dxa" w:w="50"/>
-              <w:left w:type="dxa" w:w="90"/>
-              <w:bottom w:type="dxa" w:w="50"/>
-              <w:right w:type="dxa" w:w="90"/>
-            </w:tcMar>
-          </w:tcPr>
-          <w:p>
-            <w:pPr>
-              <w:keepNext/>
-              <w:keepLines/>
-              <w:spacing w:after="0" w:before="0" w:line="280"/>
-            </w:pPr>
-            <w:r>
-              <w:rPr>
-                <w:rFonts w:ascii="Microsoft YaHei" w:eastAsia="Microsoft YaHei" w:hAnsi="Microsoft YaHei"/>
-                <w:b w:val="false"/>
-                <w:bCs w:val="false"/>
-                <w:sz w:val="18"/>
-                <w:szCs w:val="18"/>
-              </w:rPr>
-              <w:t xml:space="preserve">有全面覆盖的链接目标，以及随附国籍的决定方法</w:t>
-            </w:r>
-          </w:p>
-        </w:tc>
-        <w:tc>
-          <w:tcPr>
-            <w:tcW w:type="dxa" w:w="2771"/>
+            <w:tcW w:type="dxa" w:w="3510"/>
             <w:tcBorders>
               <w:top w:val="single" w:color="A6B8D0" w:sz="4"/>
               <w:left w:val="single" w:color="A6B8D0" w:sz="4"/>
@@ -11342,7 +10472,7 @@
         </w:trPr>
         <w:tc>
           <w:tcPr>
-            <w:tcW w:type="dxa" w:w="1883"/>
+            <w:tcW w:type="dxa" w:w="6128"/>
             <w:tcBorders>
               <w:top w:val="single" w:color="A6B8D0" w:sz="4"/>
               <w:left w:val="single" w:color="A6B8D0" w:sz="4"/>
@@ -11376,41 +10506,7 @@
         </w:tc>
         <w:tc>
           <w:tcPr>
-            <w:tcW w:type="dxa" w:w="4984"/>
-            <w:tcBorders>
-              <w:top w:val="single" w:color="A6B8D0" w:sz="4"/>
-              <w:left w:val="single" w:color="A6B8D0" w:sz="4"/>
-              <w:bottom w:val="single" w:color="A6B8D0" w:sz="4"/>
-              <w:right w:val="single" w:color="A6B8D0" w:sz="4"/>
-            </w:tcBorders>
-            <w:tcMar>
-              <w:top w:type="dxa" w:w="50"/>
-              <w:left w:type="dxa" w:w="90"/>
-              <w:bottom w:type="dxa" w:w="50"/>
-              <w:right w:type="dxa" w:w="90"/>
-            </w:tcMar>
-          </w:tcPr>
-          <w:p>
-            <w:pPr>
-              <w:keepNext/>
-              <w:keepLines/>
-              <w:spacing w:after="0" w:before="0" w:line="280"/>
-            </w:pPr>
-            <w:r>
-              <w:rPr>
-                <w:rFonts w:ascii="Microsoft YaHei" w:eastAsia="Microsoft YaHei" w:hAnsi="Microsoft YaHei"/>
-                <w:b w:val="false"/>
-                <w:bCs w:val="false"/>
-                <w:sz w:val="18"/>
-                <w:szCs w:val="18"/>
-              </w:rPr>
-              <w:t xml:space="preserve">能显示声明的文字示例（3种语言）</w:t>
-            </w:r>
-          </w:p>
-        </w:tc>
-        <w:tc>
-          <w:tcPr>
-            <w:tcW w:type="dxa" w:w="2771"/>
+            <w:tcW w:type="dxa" w:w="3510"/>
             <w:tcBorders>
               <w:top w:val="single" w:color="A6B8D0" w:sz="4"/>
               <w:left w:val="single" w:color="A6B8D0" w:sz="4"/>
@@ -11450,7 +10546,7 @@
         </w:trPr>
         <w:tc>
           <w:tcPr>
-            <w:tcW w:type="dxa" w:w="1883"/>
+            <w:tcW w:type="dxa" w:w="6128"/>
             <w:tcBorders>
               <w:top w:val="single" w:color="A6B8D0" w:sz="4"/>
               <w:left w:val="single" w:color="A6B8D0" w:sz="4"/>
@@ -11484,41 +10580,7 @@
         </w:tc>
         <w:tc>
           <w:tcPr>
-            <w:tcW w:type="dxa" w:w="4984"/>
-            <w:tcBorders>
-              <w:top w:val="single" w:color="A6B8D0" w:sz="4"/>
-              <w:left w:val="single" w:color="A6B8D0" w:sz="4"/>
-              <w:bottom w:val="single" w:color="A6B8D0" w:sz="4"/>
-              <w:right w:val="single" w:color="A6B8D0" w:sz="4"/>
-            </w:tcBorders>
-            <w:tcMar>
-              <w:top w:type="dxa" w:w="50"/>
-              <w:left w:type="dxa" w:w="90"/>
-              <w:bottom w:type="dxa" w:w="50"/>
-              <w:right w:type="dxa" w:w="90"/>
-            </w:tcMar>
-          </w:tcPr>
-          <w:p>
-            <w:pPr>
-              <w:keepNext w:val="false"/>
-              <w:keepLines/>
-              <w:spacing w:after="0" w:before="0" w:line="280"/>
-            </w:pPr>
-            <w:r>
-              <w:rPr>
-                <w:rFonts w:ascii="Microsoft YaHei" w:eastAsia="Microsoft YaHei" w:hAnsi="Microsoft YaHei"/>
-                <w:b w:val="false"/>
-                <w:bCs w:val="false"/>
-                <w:sz w:val="18"/>
-                <w:szCs w:val="18"/>
-              </w:rPr>
-              <w:t xml:space="preserve">能在声明中载入权利性比对所需的信息</w:t>
-            </w:r>
-          </w:p>
-        </w:tc>
-        <w:tc>
-          <w:tcPr>
-            <w:tcW w:type="dxa" w:w="2771"/>
+            <w:tcW w:type="dxa" w:w="3510"/>
             <w:tcBorders>
               <w:top w:val="single" w:color="A6B8D0" w:sz="4"/>
               <w:left w:val="single" w:color="A6B8D0" w:sz="4"/>
@@ -11566,42 +10628,6 @@
           <w:rFonts w:ascii="Microsoft YaHei" w:eastAsia="Microsoft YaHei" w:hAnsi="Microsoft YaHei"/>
         </w:rPr>
         <w:t xml:space="preserve">8. 本章声明的缺口</w:t>
-      </w:r>
-    </w:p>
-    <w:p>
-      <w:pPr>
-        <w:pStyle w:val="ListParagraph"/>
-        <w:keepNext/>
-        <w:keepLines/>
-        <w:numPr>
-          <w:ilvl w:val="0"/>
-          <w:numId w:val="2"/>
-        </w:numPr>
-        <w:spacing w:after="20" w:before="20" w:line="300"/>
-      </w:pPr>
-      <w:r>
-        <w:rPr>
-          <w:rFonts w:ascii="Microsoft YaHei" w:eastAsia="Microsoft YaHei" w:hAnsi="Microsoft YaHei"/>
-        </w:rPr>
-        <w:t xml:space="preserve">随附文件可能在授受的途中被去掉（D-9-4“随附文件中加入不得擅自将图片转交他人的一句话。其缺失并非权利人的过失所致”：此时不是权利人的过失）。图片清单中的使用条件会保留，但上传到社交平台后会消失。</w:t>
-      </w:r>
-    </w:p>
-    <w:p>
-      <w:pPr>
-        <w:pStyle w:val="ListParagraph"/>
-        <w:keepNext/>
-        <w:keepLines/>
-        <w:numPr>
-          <w:ilvl w:val="0"/>
-          <w:numId w:val="2"/>
-        </w:numPr>
-        <w:spacing w:after="20" w:before="20" w:line="300"/>
-      </w:pPr>
-      <w:r>
-        <w:rPr>
-          <w:rFonts w:ascii="Microsoft YaHei" w:eastAsia="Microsoft YaHei" w:hAnsi="Microsoft YaHei"/>
-        </w:rPr>
-        <w:t xml:space="preserve">随附文件是否作为合同成立因国家而异，不予保证（3.5）。</w:t>
       </w:r>
     </w:p>
     <w:p>
@@ -11619,7 +10645,7 @@
         <w:rPr>
           <w:rFonts w:ascii="Microsoft YaHei" w:eastAsia="Microsoft YaHei" w:hAnsi="Microsoft YaHei"/>
         </w:rPr>
-        <w:t xml:space="preserve">未经专家确认的国家无法制作国别部分（仅全面覆盖的链接）。</w:t>
+        <w:t xml:space="preserve">本章的缺口依第13章 4.1“机制的缺口”的表（章的栏为本章的行。附为何无法堵上、尽力的范围、剩余的风险、承担者）（本章不转载）。</w:t>
       </w:r>
     </w:p>
     <w:p>

</xml_diff>